<commit_message>
docs: update specification with sales analytics service
</commit_message>
<xml_diff>
--- a/NAIS_SpecifikacijaProjekta_RA_Tim3.docx
+++ b/NAIS_SpecifikacijaProjekta_RA_Tim3.docx
@@ -1,6 +1,6 @@
 
 <file path=word/document.xml><?xml version="1.0" encoding="utf-8"?>
-<w:document xmlns:wpc="http://schemas.microsoft.com/office/word/2010/wordprocessingCanvas" xmlns:cx="http://schemas.microsoft.com/office/drawing/2014/chartex" xmlns:cx1="http://schemas.microsoft.com/office/drawing/2015/9/8/chartex" xmlns:cx2="http://schemas.microsoft.com/office/drawing/2015/10/21/chartex" xmlns:cx3="http://schemas.microsoft.com/office/drawing/2016/5/9/chartex" xmlns:cx4="http://schemas.microsoft.com/office/drawing/2016/5/10/chartex" xmlns:cx5="http://schemas.microsoft.com/office/drawing/2016/5/11/chartex" xmlns:cx6="http://schemas.microsoft.com/office/drawing/2016/5/12/chartex" xmlns:cx7="http://schemas.microsoft.com/office/drawing/2016/5/13/chartex" xmlns:cx8="http://schemas.microsoft.com/office/drawing/2016/5/14/chartex" xmlns:mc="http://schemas.openxmlformats.org/markup-compatibility/2006" xmlns:aink="http://schemas.microsoft.com/office/drawing/2016/ink" xmlns:am3d="http://schemas.microsoft.com/office/drawing/2017/model3d" xmlns:o="urn:schemas-microsoft-com:office:office" xmlns:r="http://schemas.openxmlformats.org/officeDocument/2006/relationships" xmlns:m="http://schemas.openxmlformats.org/officeDocument/2006/math" xmlns:v="urn:schemas-microsoft-com:vml" xmlns:wp14="http://schemas.microsoft.com/office/word/2010/wordprocessingDrawing" xmlns:wp="http://schemas.openxmlformats.org/drawingml/2006/wordprocessingDrawing" xmlns:w10="urn:schemas-microsoft-com:office:word" xmlns:w="http://schemas.openxmlformats.org/wordprocessingml/2006/main" xmlns:w14="http://schemas.microsoft.com/office/word/2010/wordml" xmlns:w15="http://schemas.microsoft.com/office/word/2012/wordml" xmlns:w16cid="http://schemas.microsoft.com/office/word/2016/wordml/cid" xmlns:w16se="http://schemas.microsoft.com/office/word/2015/wordml/symex" xmlns:wpg="http://schemas.microsoft.com/office/word/2010/wordprocessingGroup" xmlns:wpi="http://schemas.microsoft.com/office/word/2010/wordprocessingInk" xmlns:wne="http://schemas.microsoft.com/office/word/2006/wordml" xmlns:wps="http://schemas.microsoft.com/office/word/2010/wordprocessingShape" mc:Ignorable="w14 w15 w16se w16cid wp14">
+<w:document xmlns:wpc="http://schemas.microsoft.com/office/word/2010/wordprocessingCanvas" xmlns:cx="http://schemas.microsoft.com/office/drawing/2014/chartex" xmlns:cx1="http://schemas.microsoft.com/office/drawing/2015/9/8/chartex" xmlns:cx2="http://schemas.microsoft.com/office/drawing/2015/10/21/chartex" xmlns:cx3="http://schemas.microsoft.com/office/drawing/2016/5/9/chartex" xmlns:cx4="http://schemas.microsoft.com/office/drawing/2016/5/10/chartex" xmlns:cx5="http://schemas.microsoft.com/office/drawing/2016/5/11/chartex" xmlns:cx6="http://schemas.microsoft.com/office/drawing/2016/5/12/chartex" xmlns:cx7="http://schemas.microsoft.com/office/drawing/2016/5/13/chartex" xmlns:cx8="http://schemas.microsoft.com/office/drawing/2016/5/14/chartex" xmlns:mc="http://schemas.openxmlformats.org/markup-compatibility/2006" xmlns:aink="http://schemas.microsoft.com/office/drawing/2016/ink" xmlns:am3d="http://schemas.microsoft.com/office/drawing/2017/model3d" xmlns:o="urn:schemas-microsoft-com:office:office" xmlns:oel="http://schemas.microsoft.com/office/2019/extlst" xmlns:r="http://schemas.openxmlformats.org/officeDocument/2006/relationships" xmlns:m="http://schemas.openxmlformats.org/officeDocument/2006/math" xmlns:v="urn:schemas-microsoft-com:vml" xmlns:wp14="http://schemas.microsoft.com/office/word/2010/wordprocessingDrawing" xmlns:wp="http://schemas.openxmlformats.org/drawingml/2006/wordprocessingDrawing" xmlns:w10="urn:schemas-microsoft-com:office:word" xmlns:w="http://schemas.openxmlformats.org/wordprocessingml/2006/main" xmlns:w14="http://schemas.microsoft.com/office/word/2010/wordml" xmlns:w15="http://schemas.microsoft.com/office/word/2012/wordml" xmlns:w16cex="http://schemas.microsoft.com/office/word/2018/wordml/cex" xmlns:w16cid="http://schemas.microsoft.com/office/word/2016/wordml/cid" xmlns:w16="http://schemas.microsoft.com/office/word/2018/wordml" xmlns:w16du="http://schemas.microsoft.com/office/word/2023/wordml/word16du" xmlns:w16sdtdh="http://schemas.microsoft.com/office/word/2020/wordml/sdtdatahash" xmlns:w16sdtfl="http://schemas.microsoft.com/office/word/2024/wordml/sdtformatlock" xmlns:w16se="http://schemas.microsoft.com/office/word/2015/wordml/symex" xmlns:wpg="http://schemas.microsoft.com/office/word/2010/wordprocessingGroup" xmlns:wpi="http://schemas.microsoft.com/office/word/2010/wordprocessingInk" xmlns:wne="http://schemas.microsoft.com/office/word/2006/wordml" xmlns:wps="http://schemas.microsoft.com/office/word/2010/wordprocessingShape" mc:Ignorable="w14 w15 w16se w16cid w16 w16cex w16sdtdh w16sdtfl w16du wp14">
   <w:body>
     <w:p>
       <w:pPr>
@@ -1248,14 +1248,7 @@
                 <w:i/>
                 <w:sz w:val="24"/>
               </w:rPr>
-              <w:t>modelovanju i analizi odnosa izmeđ</w:t>
-            </w:r>
-            <w:r>
-              <w:rPr>
-                <w:i/>
-                <w:sz w:val="24"/>
-              </w:rPr>
-              <w:t>u entiteta, kao i podršci donošenju poslovnih odluka kroz obradu podataka u različitim tipovima NoSQL baza podataka.</w:t>
+              <w:t>modelovanju i analizi odnosa između entiteta, kao i podršci donošenju poslovnih odluka kroz obradu podataka u različitim tipovima NoSQL baza podataka.</w:t>
             </w:r>
           </w:p>
         </w:tc>
@@ -1351,14 +1344,7 @@
                 <w:i/>
                 <w:sz w:val="24"/>
               </w:rPr>
-              <w:t xml:space="preserve">Motivacija za uvođenje ovog sistema je potreba da se na jednostavan i efikasan način upravljaju različiti tipovi podataka i poslovnih procesa u farmaceutskoj kompaniji. Različiti delovi sistema imaju različite zahteve, na primer, neki rade sa hijerarhijom </w:t>
-            </w:r>
-            <w:r>
-              <w:rPr>
-                <w:i/>
-                <w:sz w:val="24"/>
-              </w:rPr>
-              <w:t>proizvoda, neki sa cenama kroz vreme, a neki sa relacijama između kupaca i prodajnih procesa. Zbog toga se koriste različite NoSQL baze podataka koje su prilagođene konkretnim potrebama, što omogućava brži rad sistema i lakšu obradu podataka.</w:t>
+              <w:t>Motivacija za uvođenje ovog sistema je potreba da se na jednostavan i efikasan način upravljaju različiti tipovi podataka i poslovnih procesa u farmaceutskoj kompaniji. Različiti delovi sistema imaju različite zahteve, na primer, neki rade sa hijerarhijom proizvoda, neki sa cenama kroz vreme, a neki sa relacijama između kupaca i prodajnih procesa. Zbog toga se koriste različite NoSQL baze podataka koje su prilagođene konkretnim potrebama, što omogućava brži rad sistema i lakšu obradu podataka.</w:t>
             </w:r>
           </w:p>
         </w:tc>
@@ -1440,14 +1426,7 @@
                 <w:b/>
                 <w:sz w:val="24"/>
               </w:rPr>
-              <w:t>predm</w:t>
-            </w:r>
-            <w:r>
-              <w:rPr>
-                <w:b/>
-                <w:sz w:val="24"/>
-              </w:rPr>
-              <w:t>etnog</w:t>
+              <w:t>predmetnog</w:t>
             </w:r>
             <w:r>
               <w:rPr>
@@ -1875,7 +1854,7 @@
       </w:tr>
       <w:tr>
         <w:trPr>
-          <w:trHeight w:val="11849"/>
+          <w:trHeight w:val="4041"/>
         </w:trPr>
         <w:tc>
           <w:tcPr>
@@ -1936,14 +1915,7 @@
                 <w:i/>
                 <w:sz w:val="24"/>
               </w:rPr>
-              <w:t>Mikroservis zadužen za podsistem za praćenje procesa prodaje u farmaceutskoj kompaniji. Omogućava upravljanje kupcima, prodajnim procesima, fazama prodaje i prodajnim predstavnicima, kao i definisanje relacija između njih</w:t>
-            </w:r>
-            <w:r>
-              <w:rPr>
-                <w:i/>
-                <w:sz w:val="24"/>
-              </w:rPr>
-              <w:t>.Takodje ovaj mikroservis se koristi za praćenje neželjenih efekata lekova kao i za evidenciju i analizu prijava od strane pacijenata ili lekara.</w:t>
+              <w:t>Mikroservis zadužen za podsistem za praćenje procesa prodaje u farmaceutskoj kompaniji. Omogućava upravljanje kupcima, prodajnim procesima, fazama prodaje i prodajnim predstavnicima, kao i definisanje relacija između njih.Takodje ovaj mikroservis se koristi za praćenje neželjenih efekata lekova kao i za evidenciju i analizu prijava od strane pacijenata ili lekara.</w:t>
             </w:r>
           </w:p>
           <w:p>
@@ -1975,14 +1947,7 @@
                 <w:i/>
                 <w:sz w:val="24"/>
               </w:rPr>
-              <w:t xml:space="preserve">Svrha mikroservisa je modelovanje i praćenje toka prodajnog procesa kroz definisane faze, </w:t>
-            </w:r>
-            <w:r>
-              <w:rPr>
-                <w:i/>
-                <w:sz w:val="24"/>
-              </w:rPr>
-              <w:t>kao i izvođenje složenih upita nad grafom radi analize prodajnih aktivnosti i donošenja poslovnih odluka.Takodje svrha mikroservisa</w:t>
+              <w:t>Svrha mikroservisa je modelovanje i praćenje toka prodajnog procesa kroz definisane faze, kao i izvođenje složenih upita nad grafom radi analize prodajnih aktivnosti i donošenja poslovnih odluka.Takodje svrha mikroservisa</w:t>
             </w:r>
             <w:r>
               <w:rPr>
@@ -2029,21 +1994,7 @@
                 <w:i/>
                 <w:sz w:val="24"/>
               </w:rPr>
-              <w:t>Neo4j grafskа baza po</w:t>
-            </w:r>
-            <w:r>
-              <w:rPr>
-                <w:i/>
-                <w:sz w:val="24"/>
-              </w:rPr>
-              <w:t>dataka, namenjena za modelovanje odnosa između entiteta kao što su kupci, prodajni procesi, faze i prodajni predstavnici, kao i za efikasno izvršavanje upita nad relacijama.Ova grafska baza je korišćena za modelovanje veza izmedju entiteta radi lakšeg prać</w:t>
-            </w:r>
-            <w:r>
-              <w:rPr>
-                <w:i/>
-                <w:sz w:val="24"/>
-              </w:rPr>
-              <w:t>enja neželjenih efekata lekova.</w:t>
+              <w:t>Neo4j grafskа baza podataka, namenjena za modelovanje odnosa između entiteta kao što su kupci, prodajni procesi, faze i prodajni predstavnici, kao i za efikasno izvršavanje upita nad relacijama.Ova grafska baza je korišćena za modelovanje veza izmedju entiteta radi lakšeg praćenja neželjenih efekata lekova.</w:t>
             </w:r>
           </w:p>
           <w:p>
@@ -2101,14 +2052,7 @@
                 <w:i/>
                 <w:sz w:val="24"/>
               </w:rPr>
-              <w:t>Mikroservis koji je deo podsistema za kreiranje i upravljanje cenovnicima. Omogućava kreiranje timova, dodeljivanje članova istim, postaviti tim tim da radi na odredjenom cenovniku koji s</w:t>
-            </w:r>
-            <w:r>
-              <w:rPr>
-                <w:i/>
-                <w:sz w:val="24"/>
-              </w:rPr>
-              <w:t>e razvija za zadatom region. Takodje, evidentiraju se raznolike akcije koje članovi tima izvršavaju.</w:t>
+              <w:t>Mikroservis koji je deo podsistema za kreiranje i upravljanje cenovnicima. Omogućava kreiranje timova, dodeljivanje članova istim, postaviti tim tim da radi na odredjenom cenovniku koji se razvija za zadatom region. Takodje, evidentiraju se raznolike akcije koje članovi tima izvršavaju.</w:t>
             </w:r>
           </w:p>
           <w:p>
@@ -2163,14 +2107,7 @@
                 <w:i/>
                 <w:sz w:val="24"/>
               </w:rPr>
-              <w:t xml:space="preserve">se spreče konflikti pri radu i da se omogući analitika </w:t>
-            </w:r>
-            <w:r>
-              <w:rPr>
-                <w:i/>
-                <w:sz w:val="24"/>
-              </w:rPr>
-              <w:t>produktivnosti na osnovu istorije akcija korisnika. Jedinstven pogled na kolaboraciju unutar i odgovornost svih timova u kompaniji.</w:t>
+              <w:t>se spreče konflikti pri radu i da se omogući analitika produktivnosti na osnovu istorije akcija korisnika. Jedinstven pogled na kolaboraciju unutar i odgovornost svih timova u kompaniji.</w:t>
             </w:r>
           </w:p>
           <w:p>
@@ -2202,14 +2139,7 @@
                 <w:i/>
                 <w:sz w:val="24"/>
               </w:rPr>
-              <w:t>Grafska baza podataka se koristi za modelovanje i skladištenje mreže odnosa između korisnika, timova, cenovni</w:t>
-            </w:r>
-            <w:r>
-              <w:rPr>
-                <w:i/>
-                <w:sz w:val="24"/>
-              </w:rPr>
-              <w:t xml:space="preserve">ka i regiona. Olakšava kompleksne upite nad aktivnostima članova, kao što je pronalaženje svih promena koje je određeni tim napravio na cenovniku za specifičan region u realnom </w:t>
+              <w:t xml:space="preserve">Grafska baza podataka se koristi za modelovanje i skladištenje mreže odnosa između korisnika, timova, cenovnika i regiona. Olakšava kompleksne upite nad aktivnostima članova, kao što je pronalaženje svih promena koje je određeni tim napravio na cenovniku za specifičan region u realnom </w:t>
             </w:r>
             <w:r>
               <w:rPr>
@@ -2458,14 +2388,7 @@
                 <w:i/>
                 <w:sz w:val="24"/>
               </w:rPr>
-              <w:t>proizvoda, uključujući hijerarhiju proizvoda, varijante, dostupnost po tržištima i stanje proizvoda u životnom ciklusu. Mikroservis omogućava izvođenje složenih upita</w:t>
-            </w:r>
-            <w:r>
-              <w:rPr>
-                <w:i/>
-                <w:sz w:val="24"/>
-              </w:rPr>
-              <w:t xml:space="preserve"> nad grafom radi analize stanja portfolia po kategorijama, statusima i tržištima.</w:t>
+              <w:t>proizvoda, uključujući hijerarhiju proizvoda, varijante, dostupnost po tržištima i stanje proizvoda u životnom ciklusu. Mikroservis omogućava izvođenje složenih upita nad grafom radi analize stanja portfolia po kategorijama, statusima i tržištima.</w:t>
             </w:r>
           </w:p>
           <w:p>
@@ -2497,14 +2420,7 @@
                 <w:i/>
                 <w:sz w:val="24"/>
               </w:rPr>
-              <w:t>Neo4j grafskа baza podataka, korišćena za predstavljanje složenih hijerarhijskih struktura proizvoda i njihovih međusobnih veza. Omogućava efikasno modelovanje</w:t>
-            </w:r>
-            <w:r>
-              <w:rPr>
-                <w:i/>
-                <w:sz w:val="24"/>
-              </w:rPr>
-              <w:t xml:space="preserve"> odnosa između kategorija, proizvoda, varijanti i tržišta, kao i izvođenje analitičkih upita nad strukturom portfolia i statusima proizvoda.</w:t>
+              <w:t>Neo4j grafskа baza podataka, korišćena za predstavljanje složenih hijerarhijskih struktura proizvoda i njihovih međusobnih veza. Omogućava efikasno modelovanje odnosa između kategorija, proizvoda, varijanti i tržišta, kao i izvođenje analitičkih upita nad strukturom portfolia i statusima proizvoda.</w:t>
             </w:r>
           </w:p>
           <w:p>
@@ -2616,14 +2532,7 @@
                 <w:b/>
                 <w:sz w:val="24"/>
               </w:rPr>
-              <w:t>Svrha</w:t>
-            </w:r>
-            <w:r>
-              <w:rPr>
-                <w:b/>
-                <w:sz w:val="24"/>
-              </w:rPr>
-              <w:t xml:space="preserve"> mirkoservisa</w:t>
+              <w:t>Svrha mirkoservisa</w:t>
             </w:r>
             <w:r>
               <w:rPr>
@@ -2694,26 +2603,2460 @@
                 <w:i/>
                 <w:sz w:val="24"/>
               </w:rPr>
-              <w:t xml:space="preserve"> ,visoko perfomantna baza podataka dizajnirana da na efektivan način prikuplja, skladišti i analizira podatke koje sadrže vremensku odrednicu(timestamp). Sposobna da primi masivni tok podataka o svim promenama statusa svih cenovnika i vrati skoro instant odgovore na upite. </w:t>
+              <w:t xml:space="preserve"> ,visoko perfomantna baza podataka dizajnirana da na efektivan način prikuplja, skladišti i analizira podatke koje sadrže vremensku odrednicu(timestamp). Sposobna da primi masivni tok podataka o svim promenama statusa svih cenovnika i vrati skoro instant odgovore na upite.</w:t>
             </w:r>
           </w:p>
           <w:p>
             <w:pPr>
               <w:pStyle w:val="TableParagraph"/>
+              <w:numPr>
+                <w:ilvl w:val="0"/>
+                <w:numId w:val="1"/>
+              </w:numPr>
+              <w:tabs>
+                <w:tab w:val="left" w:pos="804"/>
+              </w:tabs>
+              <w:spacing w:before="0" w:line="273" w:lineRule="exact"/>
+              <w:ind w:left="804" w:hanging="359"/>
+              <w:rPr>
+                <w:i/>
+                <w:sz w:val="24"/>
+              </w:rPr>
+            </w:pPr>
+            <w:proofErr w:type="spellStart"/>
+            <w:r>
+              <w:rPr>
+                <w:i/>
+                <w:sz w:val="24"/>
+                <w:lang w:val="en-US"/>
+              </w:rPr>
+              <w:t>SalesAnalyticsService</w:t>
+            </w:r>
+            <w:proofErr w:type="spellEnd"/>
+            <w:r>
+              <w:rPr>
+                <w:i/>
+                <w:sz w:val="24"/>
+                <w:lang w:val="en-US"/>
+              </w:rPr>
+              <w:t>:</w:t>
+            </w:r>
+          </w:p>
+          <w:p>
+            <w:pPr>
+              <w:pStyle w:val="TableParagraph"/>
+              <w:numPr>
+                <w:ilvl w:val="1"/>
+                <w:numId w:val="1"/>
+              </w:numPr>
               <w:tabs>
                 <w:tab w:val="left" w:pos="1525"/>
               </w:tabs>
-              <w:spacing w:before="0" w:line="261" w:lineRule="auto"/>
-              <w:ind w:left="1525" w:right="72"/>
-              <w:rPr>
-                <w:i/>
-                <w:sz w:val="24"/>
+              <w:spacing w:line="261" w:lineRule="auto"/>
+              <w:ind w:right="72"/>
+              <w:rPr>
+                <w:i/>
+                <w:sz w:val="24"/>
+                <w:lang w:val="en-US"/>
               </w:rPr>
             </w:pPr>
-            <w:r>
-              <w:rPr>
-                <w:i/>
-                <w:sz w:val="24"/>
+            <w:proofErr w:type="spellStart"/>
+            <w:r>
+              <w:rPr>
+                <w:b/>
+                <w:bCs/>
+                <w:iCs/>
+                <w:sz w:val="24"/>
+                <w:lang w:val="en-US"/>
+              </w:rPr>
+              <w:t>Opis</w:t>
+            </w:r>
+            <w:proofErr w:type="spellEnd"/>
+            <w:r>
+              <w:rPr>
+                <w:iCs/>
+                <w:sz w:val="24"/>
+                <w:lang w:val="en-US"/>
+              </w:rPr>
+              <w:t>:</w:t>
+            </w:r>
+            <w:r>
+              <w:rPr>
+                <w:i/>
+                <w:sz w:val="24"/>
+                <w:lang w:val="en-US"/>
+              </w:rPr>
+              <w:t xml:space="preserve"> </w:t>
+            </w:r>
+            <w:proofErr w:type="spellStart"/>
+            <w:r>
+              <w:rPr>
+                <w:i/>
+                <w:sz w:val="24"/>
+                <w:lang w:val="en-US"/>
+              </w:rPr>
+              <w:t>Mikroservis</w:t>
+            </w:r>
+            <w:proofErr w:type="spellEnd"/>
+            <w:r>
+              <w:rPr>
+                <w:i/>
+                <w:sz w:val="24"/>
+                <w:lang w:val="en-US"/>
+              </w:rPr>
+              <w:t xml:space="preserve"> </w:t>
+            </w:r>
+            <w:proofErr w:type="spellStart"/>
+            <w:r>
+              <w:rPr>
+                <w:i/>
+                <w:sz w:val="24"/>
+                <w:lang w:val="en-US"/>
+              </w:rPr>
+              <w:t>zadužen</w:t>
+            </w:r>
+            <w:proofErr w:type="spellEnd"/>
+            <w:r>
+              <w:rPr>
+                <w:i/>
+                <w:sz w:val="24"/>
+                <w:lang w:val="en-US"/>
+              </w:rPr>
+              <w:t xml:space="preserve"> za </w:t>
+            </w:r>
+            <w:proofErr w:type="spellStart"/>
+            <w:r>
+              <w:rPr>
+                <w:i/>
+                <w:sz w:val="24"/>
+                <w:lang w:val="en-US"/>
+              </w:rPr>
+              <w:t>analitiku</w:t>
+            </w:r>
+            <w:proofErr w:type="spellEnd"/>
+            <w:r>
+              <w:rPr>
+                <w:i/>
+                <w:sz w:val="24"/>
+                <w:lang w:val="en-US"/>
+              </w:rPr>
+              <w:t xml:space="preserve"> </w:t>
+            </w:r>
+            <w:proofErr w:type="spellStart"/>
+            <w:r>
+              <w:rPr>
+                <w:i/>
+                <w:sz w:val="24"/>
+                <w:lang w:val="en-US"/>
+              </w:rPr>
+              <w:t>prodajnih</w:t>
+            </w:r>
+            <w:proofErr w:type="spellEnd"/>
+            <w:r>
+              <w:rPr>
+                <w:i/>
+                <w:sz w:val="24"/>
+                <w:lang w:val="en-US"/>
+              </w:rPr>
+              <w:t xml:space="preserve"> </w:t>
+            </w:r>
+            <w:proofErr w:type="spellStart"/>
+            <w:r>
+              <w:rPr>
+                <w:i/>
+                <w:sz w:val="24"/>
+                <w:lang w:val="en-US"/>
+              </w:rPr>
+              <w:t>procesa</w:t>
+            </w:r>
+            <w:proofErr w:type="spellEnd"/>
+            <w:r>
+              <w:rPr>
+                <w:i/>
+                <w:sz w:val="24"/>
+                <w:lang w:val="en-US"/>
+              </w:rPr>
+              <w:t xml:space="preserve"> u </w:t>
+            </w:r>
+            <w:proofErr w:type="spellStart"/>
+            <w:r>
+              <w:rPr>
+                <w:i/>
+                <w:sz w:val="24"/>
+                <w:lang w:val="en-US"/>
+              </w:rPr>
+              <w:t>farmaceutskoj</w:t>
+            </w:r>
+            <w:proofErr w:type="spellEnd"/>
+            <w:r>
+              <w:rPr>
+                <w:i/>
+                <w:sz w:val="24"/>
+                <w:lang w:val="en-US"/>
+              </w:rPr>
+              <w:t xml:space="preserve"> </w:t>
+            </w:r>
+            <w:proofErr w:type="spellStart"/>
+            <w:r>
+              <w:rPr>
+                <w:i/>
+                <w:sz w:val="24"/>
+                <w:lang w:val="en-US"/>
+              </w:rPr>
+              <w:t>kompaniji</w:t>
+            </w:r>
+            <w:proofErr w:type="spellEnd"/>
+            <w:r>
+              <w:rPr>
+                <w:i/>
+                <w:sz w:val="24"/>
+                <w:lang w:val="en-US"/>
+              </w:rPr>
+              <w:t xml:space="preserve">. Prikuplja </w:t>
+            </w:r>
+            <w:proofErr w:type="spellStart"/>
+            <w:r>
+              <w:rPr>
+                <w:i/>
+                <w:sz w:val="24"/>
+                <w:lang w:val="en-US"/>
+              </w:rPr>
+              <w:lastRenderedPageBreak/>
+              <w:t>podatke</w:t>
+            </w:r>
+            <w:proofErr w:type="spellEnd"/>
+            <w:r>
+              <w:rPr>
+                <w:i/>
+                <w:sz w:val="24"/>
+                <w:lang w:val="en-US"/>
+              </w:rPr>
+              <w:t xml:space="preserve"> o </w:t>
+            </w:r>
+            <w:proofErr w:type="spellStart"/>
+            <w:r>
+              <w:rPr>
+                <w:i/>
+                <w:sz w:val="24"/>
+                <w:lang w:val="en-US"/>
+              </w:rPr>
+              <w:t>toku</w:t>
+            </w:r>
+            <w:proofErr w:type="spellEnd"/>
+            <w:r>
+              <w:rPr>
+                <w:i/>
+                <w:sz w:val="24"/>
+                <w:lang w:val="en-US"/>
+              </w:rPr>
+              <w:t xml:space="preserve"> </w:t>
+            </w:r>
+            <w:proofErr w:type="spellStart"/>
+            <w:r>
+              <w:rPr>
+                <w:i/>
+                <w:sz w:val="24"/>
+                <w:lang w:val="en-US"/>
+              </w:rPr>
+              <w:t>prodajnih</w:t>
+            </w:r>
+            <w:proofErr w:type="spellEnd"/>
+            <w:r>
+              <w:rPr>
+                <w:i/>
+                <w:sz w:val="24"/>
+                <w:lang w:val="en-US"/>
+              </w:rPr>
+              <w:t xml:space="preserve"> </w:t>
+            </w:r>
+            <w:proofErr w:type="spellStart"/>
+            <w:r>
+              <w:rPr>
+                <w:i/>
+                <w:sz w:val="24"/>
+                <w:lang w:val="en-US"/>
+              </w:rPr>
+              <w:t>procesa</w:t>
+            </w:r>
+            <w:proofErr w:type="spellEnd"/>
+            <w:r>
+              <w:rPr>
+                <w:i/>
+                <w:sz w:val="24"/>
+                <w:lang w:val="en-US"/>
+              </w:rPr>
+              <w:t xml:space="preserve"> </w:t>
+            </w:r>
+            <w:proofErr w:type="spellStart"/>
+            <w:r>
+              <w:rPr>
+                <w:i/>
+                <w:sz w:val="24"/>
+                <w:lang w:val="en-US"/>
+              </w:rPr>
+              <w:t>iz</w:t>
+            </w:r>
+            <w:proofErr w:type="spellEnd"/>
+            <w:r>
+              <w:rPr>
+                <w:i/>
+                <w:sz w:val="24"/>
+                <w:lang w:val="en-US"/>
+              </w:rPr>
+              <w:t xml:space="preserve"> </w:t>
+            </w:r>
+            <w:proofErr w:type="spellStart"/>
+            <w:r>
+              <w:rPr>
+                <w:i/>
+                <w:sz w:val="24"/>
+                <w:lang w:val="en-US"/>
+              </w:rPr>
+              <w:t>drugih</w:t>
+            </w:r>
+            <w:proofErr w:type="spellEnd"/>
+            <w:r>
+              <w:rPr>
+                <w:i/>
+                <w:sz w:val="24"/>
+                <w:lang w:val="en-US"/>
+              </w:rPr>
+              <w:t xml:space="preserve"> </w:t>
+            </w:r>
+            <w:proofErr w:type="spellStart"/>
+            <w:r>
+              <w:rPr>
+                <w:i/>
+                <w:sz w:val="24"/>
+                <w:lang w:val="en-US"/>
+              </w:rPr>
+              <w:t>mikroservisa</w:t>
+            </w:r>
+            <w:proofErr w:type="spellEnd"/>
+            <w:r>
+              <w:rPr>
+                <w:i/>
+                <w:sz w:val="24"/>
+                <w:lang w:val="en-US"/>
+              </w:rPr>
+              <w:t xml:space="preserve"> </w:t>
+            </w:r>
+            <w:proofErr w:type="spellStart"/>
+            <w:r>
+              <w:rPr>
+                <w:i/>
+                <w:sz w:val="24"/>
+                <w:lang w:val="en-US"/>
+              </w:rPr>
+              <w:t>i</w:t>
+            </w:r>
+            <w:proofErr w:type="spellEnd"/>
+            <w:r>
+              <w:rPr>
+                <w:i/>
+                <w:sz w:val="24"/>
+                <w:lang w:val="en-US"/>
+              </w:rPr>
+              <w:t xml:space="preserve"> </w:t>
+            </w:r>
+            <w:proofErr w:type="spellStart"/>
+            <w:r>
+              <w:rPr>
+                <w:i/>
+                <w:sz w:val="24"/>
+                <w:lang w:val="en-US"/>
+              </w:rPr>
+              <w:t>omogućava</w:t>
+            </w:r>
+            <w:proofErr w:type="spellEnd"/>
+            <w:r>
+              <w:rPr>
+                <w:i/>
+                <w:sz w:val="24"/>
+                <w:lang w:val="en-US"/>
+              </w:rPr>
+              <w:t xml:space="preserve"> </w:t>
+            </w:r>
+            <w:proofErr w:type="spellStart"/>
+            <w:r>
+              <w:rPr>
+                <w:i/>
+                <w:sz w:val="24"/>
+                <w:lang w:val="en-US"/>
+              </w:rPr>
+              <w:t>izvođenje</w:t>
+            </w:r>
+            <w:proofErr w:type="spellEnd"/>
+            <w:r>
+              <w:rPr>
+                <w:i/>
+                <w:sz w:val="24"/>
+                <w:lang w:val="en-US"/>
+              </w:rPr>
+              <w:t xml:space="preserve"> </w:t>
+            </w:r>
+            <w:proofErr w:type="spellStart"/>
+            <w:r>
+              <w:rPr>
+                <w:i/>
+                <w:sz w:val="24"/>
+                <w:lang w:val="en-US"/>
+              </w:rPr>
+              <w:t>različitih</w:t>
+            </w:r>
+            <w:proofErr w:type="spellEnd"/>
+            <w:r>
+              <w:rPr>
+                <w:i/>
+                <w:sz w:val="24"/>
+                <w:lang w:val="en-US"/>
+              </w:rPr>
+              <w:t xml:space="preserve"> </w:t>
+            </w:r>
+            <w:proofErr w:type="spellStart"/>
+            <w:r>
+              <w:rPr>
+                <w:i/>
+                <w:sz w:val="24"/>
+                <w:lang w:val="en-US"/>
+              </w:rPr>
+              <w:t>poslovnih</w:t>
+            </w:r>
+            <w:proofErr w:type="spellEnd"/>
+            <w:r>
+              <w:rPr>
+                <w:i/>
+                <w:sz w:val="24"/>
+                <w:lang w:val="en-US"/>
+              </w:rPr>
+              <w:t xml:space="preserve"> </w:t>
+            </w:r>
+            <w:proofErr w:type="spellStart"/>
+            <w:r>
+              <w:rPr>
+                <w:i/>
+                <w:sz w:val="24"/>
+                <w:lang w:val="en-US"/>
+              </w:rPr>
+              <w:t>analiza</w:t>
+            </w:r>
+            <w:proofErr w:type="spellEnd"/>
+            <w:r>
+              <w:rPr>
+                <w:i/>
+                <w:sz w:val="24"/>
+                <w:lang w:val="en-US"/>
+              </w:rPr>
+              <w:t xml:space="preserve"> </w:t>
+            </w:r>
+            <w:proofErr w:type="spellStart"/>
+            <w:r>
+              <w:rPr>
+                <w:i/>
+                <w:sz w:val="24"/>
+                <w:lang w:val="en-US"/>
+              </w:rPr>
+              <w:t>nad</w:t>
+            </w:r>
+            <w:proofErr w:type="spellEnd"/>
+            <w:r>
+              <w:rPr>
+                <w:i/>
+                <w:sz w:val="24"/>
+                <w:lang w:val="en-US"/>
+              </w:rPr>
+              <w:t xml:space="preserve"> </w:t>
+            </w:r>
+            <w:proofErr w:type="spellStart"/>
+            <w:r>
+              <w:rPr>
+                <w:i/>
+                <w:sz w:val="24"/>
+                <w:lang w:val="en-US"/>
+              </w:rPr>
+              <w:t>istorijskim</w:t>
+            </w:r>
+            <w:proofErr w:type="spellEnd"/>
+            <w:r>
+              <w:rPr>
+                <w:i/>
+                <w:sz w:val="24"/>
+                <w:lang w:val="en-US"/>
+              </w:rPr>
+              <w:t xml:space="preserve"> </w:t>
+            </w:r>
+            <w:proofErr w:type="spellStart"/>
+            <w:r>
+              <w:rPr>
+                <w:i/>
+                <w:sz w:val="24"/>
+                <w:lang w:val="en-US"/>
+              </w:rPr>
+              <w:t>podacima</w:t>
+            </w:r>
+            <w:proofErr w:type="spellEnd"/>
+            <w:r>
+              <w:rPr>
+                <w:i/>
+                <w:sz w:val="24"/>
+                <w:lang w:val="en-US"/>
+              </w:rPr>
+              <w:t>.</w:t>
+            </w:r>
+          </w:p>
+          <w:p>
+            <w:pPr>
+              <w:pStyle w:val="TableParagraph"/>
+              <w:numPr>
+                <w:ilvl w:val="1"/>
+                <w:numId w:val="1"/>
+              </w:numPr>
+              <w:tabs>
+                <w:tab w:val="left" w:pos="1525"/>
+              </w:tabs>
+              <w:spacing w:line="261" w:lineRule="auto"/>
+              <w:ind w:right="72"/>
+              <w:rPr>
+                <w:i/>
+                <w:sz w:val="24"/>
+                <w:lang w:val="en-US"/>
+              </w:rPr>
+            </w:pPr>
+            <w:proofErr w:type="spellStart"/>
+            <w:r>
+              <w:rPr>
+                <w:b/>
+                <w:bCs/>
+                <w:iCs/>
+                <w:sz w:val="24"/>
+                <w:lang w:val="en-US"/>
+              </w:rPr>
+              <w:t>Svrha</w:t>
+            </w:r>
+            <w:proofErr w:type="spellEnd"/>
+            <w:r>
+              <w:rPr>
+                <w:b/>
+                <w:bCs/>
+                <w:iCs/>
+                <w:sz w:val="24"/>
+                <w:lang w:val="en-US"/>
+              </w:rPr>
+              <w:t xml:space="preserve"> </w:t>
+            </w:r>
+            <w:proofErr w:type="spellStart"/>
+            <w:r>
+              <w:rPr>
+                <w:b/>
+                <w:bCs/>
+                <w:iCs/>
+                <w:sz w:val="24"/>
+                <w:lang w:val="en-US"/>
+              </w:rPr>
+              <w:t>mikroservisa</w:t>
+            </w:r>
+            <w:proofErr w:type="spellEnd"/>
+            <w:r>
+              <w:rPr>
+                <w:iCs/>
+                <w:sz w:val="24"/>
+                <w:lang w:val="en-US"/>
+              </w:rPr>
+              <w:t>:</w:t>
+            </w:r>
+            <w:r>
+              <w:rPr>
+                <w:i/>
+                <w:sz w:val="24"/>
+                <w:lang w:val="en-US"/>
+              </w:rPr>
+              <w:t xml:space="preserve"> </w:t>
+            </w:r>
+            <w:proofErr w:type="spellStart"/>
+            <w:r>
+              <w:rPr>
+                <w:i/>
+                <w:sz w:val="24"/>
+                <w:lang w:val="en-US"/>
+              </w:rPr>
+              <w:t>Svrha</w:t>
+            </w:r>
+            <w:proofErr w:type="spellEnd"/>
+            <w:r>
+              <w:rPr>
+                <w:i/>
+                <w:sz w:val="24"/>
+                <w:lang w:val="en-US"/>
+              </w:rPr>
+              <w:t xml:space="preserve"> </w:t>
+            </w:r>
+            <w:proofErr w:type="spellStart"/>
+            <w:r>
+              <w:rPr>
+                <w:i/>
+                <w:sz w:val="24"/>
+                <w:lang w:val="en-US"/>
+              </w:rPr>
+              <w:t>mikroservisa</w:t>
+            </w:r>
+            <w:proofErr w:type="spellEnd"/>
+            <w:r>
+              <w:rPr>
+                <w:i/>
+                <w:sz w:val="24"/>
+                <w:lang w:val="en-US"/>
+              </w:rPr>
+              <w:t xml:space="preserve"> je </w:t>
+            </w:r>
+            <w:proofErr w:type="spellStart"/>
+            <w:r>
+              <w:rPr>
+                <w:i/>
+                <w:sz w:val="24"/>
+                <w:lang w:val="en-US"/>
+              </w:rPr>
+              <w:t>identifikacija</w:t>
+            </w:r>
+            <w:proofErr w:type="spellEnd"/>
+            <w:r>
+              <w:rPr>
+                <w:i/>
+                <w:sz w:val="24"/>
+                <w:lang w:val="en-US"/>
+              </w:rPr>
+              <w:t xml:space="preserve"> </w:t>
+            </w:r>
+            <w:proofErr w:type="spellStart"/>
+            <w:r>
+              <w:rPr>
+                <w:i/>
+                <w:sz w:val="24"/>
+                <w:lang w:val="en-US"/>
+              </w:rPr>
+              <w:t>uskih</w:t>
+            </w:r>
+            <w:proofErr w:type="spellEnd"/>
+            <w:r>
+              <w:rPr>
+                <w:i/>
+                <w:sz w:val="24"/>
+                <w:lang w:val="en-US"/>
+              </w:rPr>
+              <w:t xml:space="preserve"> </w:t>
+            </w:r>
+            <w:proofErr w:type="spellStart"/>
+            <w:r>
+              <w:rPr>
+                <w:i/>
+                <w:sz w:val="24"/>
+                <w:lang w:val="en-US"/>
+              </w:rPr>
+              <w:t>grla</w:t>
+            </w:r>
+            <w:proofErr w:type="spellEnd"/>
+            <w:r>
+              <w:rPr>
+                <w:i/>
+                <w:sz w:val="24"/>
+                <w:lang w:val="en-US"/>
+              </w:rPr>
+              <w:t xml:space="preserve"> u </w:t>
+            </w:r>
+            <w:proofErr w:type="spellStart"/>
+            <w:r>
+              <w:rPr>
+                <w:i/>
+                <w:sz w:val="24"/>
+                <w:lang w:val="en-US"/>
+              </w:rPr>
+              <w:t>prodajnom</w:t>
+            </w:r>
+            <w:proofErr w:type="spellEnd"/>
+            <w:r>
+              <w:rPr>
+                <w:i/>
+                <w:sz w:val="24"/>
+                <w:lang w:val="en-US"/>
+              </w:rPr>
+              <w:t xml:space="preserve"> </w:t>
+            </w:r>
+            <w:proofErr w:type="spellStart"/>
+            <w:r>
+              <w:rPr>
+                <w:i/>
+                <w:sz w:val="24"/>
+                <w:lang w:val="en-US"/>
+              </w:rPr>
+              <w:t>procesu</w:t>
+            </w:r>
+            <w:proofErr w:type="spellEnd"/>
+            <w:r>
+              <w:rPr>
+                <w:i/>
+                <w:sz w:val="24"/>
+                <w:lang w:val="en-US"/>
+              </w:rPr>
+              <w:t xml:space="preserve">, </w:t>
+            </w:r>
+            <w:proofErr w:type="spellStart"/>
+            <w:r>
+              <w:rPr>
+                <w:i/>
+                <w:sz w:val="24"/>
+                <w:lang w:val="en-US"/>
+              </w:rPr>
+              <w:t>analiza</w:t>
+            </w:r>
+            <w:proofErr w:type="spellEnd"/>
+            <w:r>
+              <w:rPr>
+                <w:i/>
+                <w:sz w:val="24"/>
+                <w:lang w:val="en-US"/>
+              </w:rPr>
+              <w:t xml:space="preserve"> </w:t>
+            </w:r>
+            <w:proofErr w:type="spellStart"/>
+            <w:r>
+              <w:rPr>
+                <w:i/>
+                <w:sz w:val="24"/>
+                <w:lang w:val="en-US"/>
+              </w:rPr>
+              <w:t>trajanja</w:t>
+            </w:r>
+            <w:proofErr w:type="spellEnd"/>
+            <w:r>
+              <w:rPr>
+                <w:i/>
+                <w:sz w:val="24"/>
+                <w:lang w:val="en-US"/>
+              </w:rPr>
+              <w:t xml:space="preserve"> </w:t>
+            </w:r>
+            <w:proofErr w:type="spellStart"/>
+            <w:r>
+              <w:rPr>
+                <w:i/>
+                <w:sz w:val="24"/>
+                <w:lang w:val="en-US"/>
+              </w:rPr>
+              <w:t>pojedinačnih</w:t>
+            </w:r>
+            <w:proofErr w:type="spellEnd"/>
+            <w:r>
+              <w:rPr>
+                <w:i/>
+                <w:sz w:val="24"/>
+                <w:lang w:val="en-US"/>
+              </w:rPr>
+              <w:t xml:space="preserve"> </w:t>
+            </w:r>
+            <w:proofErr w:type="spellStart"/>
+            <w:r>
+              <w:rPr>
+                <w:i/>
+                <w:sz w:val="24"/>
+                <w:lang w:val="en-US"/>
+              </w:rPr>
+              <w:t>faza</w:t>
+            </w:r>
+            <w:proofErr w:type="spellEnd"/>
+            <w:r>
+              <w:rPr>
+                <w:i/>
+                <w:sz w:val="24"/>
+                <w:lang w:val="en-US"/>
+              </w:rPr>
+              <w:t xml:space="preserve"> </w:t>
+            </w:r>
+            <w:proofErr w:type="spellStart"/>
+            <w:r>
+              <w:rPr>
+                <w:i/>
+                <w:sz w:val="24"/>
+                <w:lang w:val="en-US"/>
+              </w:rPr>
+              <w:t>prodaje</w:t>
+            </w:r>
+            <w:proofErr w:type="spellEnd"/>
+            <w:r>
+              <w:rPr>
+                <w:i/>
+                <w:sz w:val="24"/>
+                <w:lang w:val="en-US"/>
+              </w:rPr>
+              <w:t xml:space="preserve"> </w:t>
+            </w:r>
+            <w:proofErr w:type="spellStart"/>
+            <w:r>
+              <w:rPr>
+                <w:i/>
+                <w:sz w:val="24"/>
+                <w:lang w:val="en-US"/>
+              </w:rPr>
+              <w:t>i</w:t>
+            </w:r>
+            <w:proofErr w:type="spellEnd"/>
+            <w:r>
+              <w:rPr>
+                <w:i/>
+                <w:sz w:val="24"/>
+                <w:lang w:val="en-US"/>
+              </w:rPr>
+              <w:t xml:space="preserve"> </w:t>
+            </w:r>
+            <w:proofErr w:type="spellStart"/>
+            <w:r>
+              <w:rPr>
+                <w:i/>
+                <w:sz w:val="24"/>
+                <w:lang w:val="en-US"/>
+              </w:rPr>
+              <w:t>praćenje</w:t>
+            </w:r>
+            <w:proofErr w:type="spellEnd"/>
+            <w:r>
+              <w:rPr>
+                <w:i/>
+                <w:sz w:val="24"/>
+                <w:lang w:val="en-US"/>
+              </w:rPr>
+              <w:t xml:space="preserve"> </w:t>
+            </w:r>
+            <w:proofErr w:type="spellStart"/>
+            <w:r>
+              <w:rPr>
+                <w:i/>
+                <w:sz w:val="24"/>
+                <w:lang w:val="en-US"/>
+              </w:rPr>
+              <w:t>trendova</w:t>
+            </w:r>
+            <w:proofErr w:type="spellEnd"/>
+            <w:r>
+              <w:rPr>
+                <w:i/>
+                <w:sz w:val="24"/>
+                <w:lang w:val="en-US"/>
+              </w:rPr>
+              <w:t xml:space="preserve"> u </w:t>
+            </w:r>
+            <w:proofErr w:type="spellStart"/>
+            <w:r>
+              <w:rPr>
+                <w:i/>
+                <w:sz w:val="24"/>
+                <w:lang w:val="en-US"/>
+              </w:rPr>
+              <w:t>prodajnom</w:t>
+            </w:r>
+            <w:proofErr w:type="spellEnd"/>
+            <w:r>
+              <w:rPr>
+                <w:i/>
+                <w:sz w:val="24"/>
+                <w:lang w:val="en-US"/>
+              </w:rPr>
+              <w:t xml:space="preserve"> pipeline-u. </w:t>
+            </w:r>
+            <w:proofErr w:type="spellStart"/>
+            <w:r>
+              <w:rPr>
+                <w:i/>
+                <w:sz w:val="24"/>
+                <w:lang w:val="en-US"/>
+              </w:rPr>
+              <w:t>Rezultati</w:t>
+            </w:r>
+            <w:proofErr w:type="spellEnd"/>
+            <w:r>
+              <w:rPr>
+                <w:i/>
+                <w:sz w:val="24"/>
+                <w:lang w:val="en-US"/>
+              </w:rPr>
+              <w:t xml:space="preserve"> </w:t>
+            </w:r>
+            <w:proofErr w:type="spellStart"/>
+            <w:r>
+              <w:rPr>
+                <w:i/>
+                <w:sz w:val="24"/>
+                <w:lang w:val="en-US"/>
+              </w:rPr>
+              <w:t>analiza</w:t>
+            </w:r>
+            <w:proofErr w:type="spellEnd"/>
+            <w:r>
+              <w:rPr>
+                <w:i/>
+                <w:sz w:val="24"/>
+                <w:lang w:val="en-US"/>
+              </w:rPr>
+              <w:t xml:space="preserve"> </w:t>
+            </w:r>
+            <w:proofErr w:type="spellStart"/>
+            <w:r>
+              <w:rPr>
+                <w:i/>
+                <w:sz w:val="24"/>
+                <w:lang w:val="en-US"/>
+              </w:rPr>
+              <w:t>koriste</w:t>
+            </w:r>
+            <w:proofErr w:type="spellEnd"/>
+            <w:r>
+              <w:rPr>
+                <w:i/>
+                <w:sz w:val="24"/>
+                <w:lang w:val="en-US"/>
+              </w:rPr>
+              <w:t xml:space="preserve"> se za </w:t>
+            </w:r>
+            <w:proofErr w:type="spellStart"/>
+            <w:r>
+              <w:rPr>
+                <w:i/>
+                <w:sz w:val="24"/>
+                <w:lang w:val="en-US"/>
+              </w:rPr>
+              <w:t>optimizaciju</w:t>
+            </w:r>
+            <w:proofErr w:type="spellEnd"/>
+            <w:r>
+              <w:rPr>
+                <w:i/>
+                <w:sz w:val="24"/>
+                <w:lang w:val="en-US"/>
+              </w:rPr>
+              <w:t xml:space="preserve"> </w:t>
+            </w:r>
+            <w:proofErr w:type="spellStart"/>
+            <w:r>
+              <w:rPr>
+                <w:i/>
+                <w:sz w:val="24"/>
+                <w:lang w:val="en-US"/>
+              </w:rPr>
+              <w:t>prodajnih</w:t>
+            </w:r>
+            <w:proofErr w:type="spellEnd"/>
+            <w:r>
+              <w:rPr>
+                <w:i/>
+                <w:sz w:val="24"/>
+                <w:lang w:val="en-US"/>
+              </w:rPr>
+              <w:t xml:space="preserve"> </w:t>
+            </w:r>
+            <w:proofErr w:type="spellStart"/>
+            <w:r>
+              <w:rPr>
+                <w:i/>
+                <w:sz w:val="24"/>
+                <w:lang w:val="en-US"/>
+              </w:rPr>
+              <w:t>aktivnosti</w:t>
+            </w:r>
+            <w:proofErr w:type="spellEnd"/>
+            <w:r>
+              <w:rPr>
+                <w:i/>
+                <w:sz w:val="24"/>
+                <w:lang w:val="en-US"/>
+              </w:rPr>
+              <w:t xml:space="preserve"> </w:t>
+            </w:r>
+            <w:proofErr w:type="spellStart"/>
+            <w:r>
+              <w:rPr>
+                <w:i/>
+                <w:sz w:val="24"/>
+                <w:lang w:val="en-US"/>
+              </w:rPr>
+              <w:t>i</w:t>
+            </w:r>
+            <w:proofErr w:type="spellEnd"/>
+            <w:r>
+              <w:rPr>
+                <w:i/>
+                <w:sz w:val="24"/>
+                <w:lang w:val="en-US"/>
+              </w:rPr>
+              <w:t xml:space="preserve"> </w:t>
+            </w:r>
+            <w:proofErr w:type="spellStart"/>
+            <w:r>
+              <w:rPr>
+                <w:i/>
+                <w:sz w:val="24"/>
+                <w:lang w:val="en-US"/>
+              </w:rPr>
+              <w:t>donošenje</w:t>
+            </w:r>
+            <w:proofErr w:type="spellEnd"/>
+            <w:r>
+              <w:rPr>
+                <w:i/>
+                <w:sz w:val="24"/>
+                <w:lang w:val="en-US"/>
+              </w:rPr>
+              <w:t xml:space="preserve"> </w:t>
+            </w:r>
+            <w:proofErr w:type="spellStart"/>
+            <w:r>
+              <w:rPr>
+                <w:i/>
+                <w:sz w:val="24"/>
+                <w:lang w:val="en-US"/>
+              </w:rPr>
+              <w:t>poslovnih</w:t>
+            </w:r>
+            <w:proofErr w:type="spellEnd"/>
+            <w:r>
+              <w:rPr>
+                <w:i/>
+                <w:sz w:val="24"/>
+                <w:lang w:val="en-US"/>
+              </w:rPr>
+              <w:t xml:space="preserve"> </w:t>
+            </w:r>
+            <w:proofErr w:type="spellStart"/>
+            <w:r>
+              <w:rPr>
+                <w:i/>
+                <w:sz w:val="24"/>
+                <w:lang w:val="en-US"/>
+              </w:rPr>
+              <w:t>odluka</w:t>
+            </w:r>
+            <w:proofErr w:type="spellEnd"/>
+            <w:r>
+              <w:rPr>
+                <w:i/>
+                <w:sz w:val="24"/>
+                <w:lang w:val="en-US"/>
+              </w:rPr>
+              <w:t xml:space="preserve"> </w:t>
+            </w:r>
+            <w:proofErr w:type="spellStart"/>
+            <w:r>
+              <w:rPr>
+                <w:i/>
+                <w:sz w:val="24"/>
+                <w:lang w:val="en-US"/>
+              </w:rPr>
+              <w:t>zasnovanih</w:t>
+            </w:r>
+            <w:proofErr w:type="spellEnd"/>
+            <w:r>
+              <w:rPr>
+                <w:i/>
+                <w:sz w:val="24"/>
+                <w:lang w:val="en-US"/>
+              </w:rPr>
+              <w:t xml:space="preserve"> </w:t>
+            </w:r>
+            <w:proofErr w:type="spellStart"/>
+            <w:r>
+              <w:rPr>
+                <w:i/>
+                <w:sz w:val="24"/>
+                <w:lang w:val="en-US"/>
+              </w:rPr>
+              <w:t>na</w:t>
+            </w:r>
+            <w:proofErr w:type="spellEnd"/>
+            <w:r>
+              <w:rPr>
+                <w:i/>
+                <w:sz w:val="24"/>
+                <w:lang w:val="en-US"/>
+              </w:rPr>
+              <w:t xml:space="preserve"> </w:t>
+            </w:r>
+            <w:proofErr w:type="spellStart"/>
+            <w:r>
+              <w:rPr>
+                <w:i/>
+                <w:sz w:val="24"/>
+                <w:lang w:val="en-US"/>
+              </w:rPr>
+              <w:t>podacima</w:t>
+            </w:r>
+            <w:proofErr w:type="spellEnd"/>
+            <w:r>
+              <w:rPr>
+                <w:i/>
+                <w:sz w:val="24"/>
+                <w:lang w:val="en-US"/>
+              </w:rPr>
+              <w:t>.</w:t>
+            </w:r>
+          </w:p>
+          <w:p>
+            <w:pPr>
+              <w:pStyle w:val="TableParagraph"/>
+              <w:numPr>
+                <w:ilvl w:val="1"/>
+                <w:numId w:val="1"/>
+              </w:numPr>
+              <w:tabs>
+                <w:tab w:val="left" w:pos="1525"/>
+              </w:tabs>
+              <w:spacing w:line="261" w:lineRule="auto"/>
+              <w:ind w:right="72"/>
+              <w:rPr>
+                <w:i/>
+                <w:sz w:val="24"/>
+                <w:lang w:val="en-US"/>
+              </w:rPr>
+            </w:pPr>
+            <w:r>
+              <w:rPr>
+                <w:b/>
+                <w:bCs/>
+                <w:iCs/>
+                <w:sz w:val="24"/>
+                <w:lang w:val="en-US"/>
+              </w:rPr>
+              <w:t xml:space="preserve">Baza </w:t>
+            </w:r>
+            <w:proofErr w:type="spellStart"/>
+            <w:r>
+              <w:rPr>
+                <w:b/>
+                <w:bCs/>
+                <w:iCs/>
+                <w:sz w:val="24"/>
+                <w:lang w:val="en-US"/>
+              </w:rPr>
+              <w:t>podataka</w:t>
+            </w:r>
+            <w:proofErr w:type="spellEnd"/>
+            <w:r>
+              <w:rPr>
+                <w:b/>
+                <w:bCs/>
+                <w:iCs/>
+                <w:sz w:val="24"/>
+                <w:lang w:val="en-US"/>
+              </w:rPr>
+              <w:t>:</w:t>
+            </w:r>
+            <w:r>
+              <w:rPr>
+                <w:i/>
+                <w:sz w:val="24"/>
+                <w:lang w:val="en-US"/>
+              </w:rPr>
+              <w:t xml:space="preserve"> </w:t>
+            </w:r>
+            <w:proofErr w:type="spellStart"/>
+            <w:r>
+              <w:rPr>
+                <w:i/>
+                <w:sz w:val="24"/>
+                <w:lang w:val="en-US"/>
+              </w:rPr>
+              <w:t>InfluxDB</w:t>
+            </w:r>
+            <w:proofErr w:type="spellEnd"/>
+            <w:r>
+              <w:rPr>
+                <w:i/>
+                <w:sz w:val="24"/>
+                <w:lang w:val="en-US"/>
+              </w:rPr>
+              <w:t xml:space="preserve"> v2 </w:t>
+            </w:r>
+            <w:proofErr w:type="spellStart"/>
+            <w:r>
+              <w:rPr>
+                <w:i/>
+                <w:sz w:val="24"/>
+                <w:lang w:val="en-US"/>
+              </w:rPr>
+              <w:t>baza</w:t>
+            </w:r>
+            <w:proofErr w:type="spellEnd"/>
+            <w:r>
+              <w:rPr>
+                <w:i/>
+                <w:sz w:val="24"/>
+                <w:lang w:val="en-US"/>
+              </w:rPr>
+              <w:t xml:space="preserve"> </w:t>
+            </w:r>
+            <w:proofErr w:type="spellStart"/>
+            <w:r>
+              <w:rPr>
+                <w:i/>
+                <w:sz w:val="24"/>
+                <w:lang w:val="en-US"/>
+              </w:rPr>
+              <w:t>podataka</w:t>
+            </w:r>
+            <w:proofErr w:type="spellEnd"/>
+            <w:r>
+              <w:rPr>
+                <w:i/>
+                <w:sz w:val="24"/>
+                <w:lang w:val="en-US"/>
+              </w:rPr>
+              <w:t xml:space="preserve"> </w:t>
+            </w:r>
+            <w:proofErr w:type="spellStart"/>
+            <w:r>
+              <w:rPr>
+                <w:i/>
+                <w:sz w:val="24"/>
+                <w:lang w:val="en-US"/>
+              </w:rPr>
+              <w:t>vremenskih</w:t>
+            </w:r>
+            <w:proofErr w:type="spellEnd"/>
+            <w:r>
+              <w:rPr>
+                <w:i/>
+                <w:sz w:val="24"/>
+                <w:lang w:val="en-US"/>
+              </w:rPr>
+              <w:t xml:space="preserve"> </w:t>
+            </w:r>
+            <w:proofErr w:type="spellStart"/>
+            <w:r>
+              <w:rPr>
+                <w:i/>
+                <w:sz w:val="24"/>
+                <w:lang w:val="en-US"/>
+              </w:rPr>
+              <w:t>serija</w:t>
+            </w:r>
+            <w:proofErr w:type="spellEnd"/>
+            <w:r>
+              <w:rPr>
+                <w:i/>
+                <w:sz w:val="24"/>
+                <w:lang w:val="en-US"/>
+              </w:rPr>
+              <w:t xml:space="preserve"> </w:t>
+            </w:r>
+            <w:proofErr w:type="spellStart"/>
+            <w:r>
+              <w:rPr>
+                <w:i/>
+                <w:sz w:val="24"/>
+                <w:lang w:val="en-US"/>
+              </w:rPr>
+              <w:t>koristi</w:t>
+            </w:r>
+            <w:proofErr w:type="spellEnd"/>
+            <w:r>
+              <w:rPr>
+                <w:i/>
+                <w:sz w:val="24"/>
+                <w:lang w:val="en-US"/>
+              </w:rPr>
+              <w:t xml:space="preserve"> se za </w:t>
+            </w:r>
+            <w:proofErr w:type="spellStart"/>
+            <w:r>
+              <w:rPr>
+                <w:i/>
+                <w:sz w:val="24"/>
+                <w:lang w:val="en-US"/>
+              </w:rPr>
+              <w:t>čuvanje</w:t>
+            </w:r>
+            <w:proofErr w:type="spellEnd"/>
+            <w:r>
+              <w:rPr>
+                <w:i/>
+                <w:sz w:val="24"/>
+                <w:lang w:val="en-US"/>
+              </w:rPr>
+              <w:t xml:space="preserve"> </w:t>
+            </w:r>
+            <w:proofErr w:type="spellStart"/>
+            <w:r>
+              <w:rPr>
+                <w:i/>
+                <w:sz w:val="24"/>
+                <w:lang w:val="en-US"/>
+              </w:rPr>
+              <w:t>analitičkih</w:t>
+            </w:r>
+            <w:proofErr w:type="spellEnd"/>
+            <w:r>
+              <w:rPr>
+                <w:i/>
+                <w:sz w:val="24"/>
+                <w:lang w:val="en-US"/>
+              </w:rPr>
+              <w:t xml:space="preserve"> </w:t>
+            </w:r>
+            <w:proofErr w:type="spellStart"/>
+            <w:r>
+              <w:rPr>
+                <w:i/>
+                <w:sz w:val="24"/>
+                <w:lang w:val="en-US"/>
+              </w:rPr>
+              <w:t>događaja</w:t>
+            </w:r>
+            <w:proofErr w:type="spellEnd"/>
+            <w:r>
+              <w:rPr>
+                <w:i/>
+                <w:sz w:val="24"/>
+                <w:lang w:val="en-US"/>
+              </w:rPr>
+              <w:t xml:space="preserve"> </w:t>
+            </w:r>
+            <w:proofErr w:type="spellStart"/>
+            <w:r>
+              <w:rPr>
+                <w:i/>
+                <w:sz w:val="24"/>
+                <w:lang w:val="en-US"/>
+              </w:rPr>
+              <w:t>sa</w:t>
+            </w:r>
+            <w:proofErr w:type="spellEnd"/>
+            <w:r>
+              <w:rPr>
+                <w:i/>
+                <w:sz w:val="24"/>
+                <w:lang w:val="en-US"/>
+              </w:rPr>
+              <w:t xml:space="preserve"> </w:t>
+            </w:r>
+            <w:proofErr w:type="spellStart"/>
+            <w:r>
+              <w:rPr>
+                <w:i/>
+                <w:sz w:val="24"/>
+                <w:lang w:val="en-US"/>
+              </w:rPr>
+              <w:t>vremenskim</w:t>
+            </w:r>
+            <w:proofErr w:type="spellEnd"/>
+            <w:r>
+              <w:rPr>
+                <w:i/>
+                <w:sz w:val="24"/>
+                <w:lang w:val="en-US"/>
+              </w:rPr>
+              <w:t xml:space="preserve"> </w:t>
+            </w:r>
+            <w:proofErr w:type="spellStart"/>
+            <w:r>
+              <w:rPr>
+                <w:i/>
+                <w:sz w:val="24"/>
+                <w:lang w:val="en-US"/>
+              </w:rPr>
+              <w:t>oznakama</w:t>
+            </w:r>
+            <w:proofErr w:type="spellEnd"/>
+            <w:r>
+              <w:rPr>
+                <w:i/>
+                <w:sz w:val="24"/>
+                <w:lang w:val="en-US"/>
+              </w:rPr>
+              <w:t xml:space="preserve"> (timestamp). </w:t>
+            </w:r>
+            <w:proofErr w:type="spellStart"/>
+            <w:r>
+              <w:rPr>
+                <w:i/>
+                <w:sz w:val="24"/>
+                <w:lang w:val="en-US"/>
+              </w:rPr>
+              <w:t>Omogućava</w:t>
+            </w:r>
+            <w:proofErr w:type="spellEnd"/>
+            <w:r>
+              <w:rPr>
+                <w:i/>
+                <w:sz w:val="24"/>
+                <w:lang w:val="en-US"/>
+              </w:rPr>
+              <w:t xml:space="preserve"> </w:t>
+            </w:r>
+            <w:proofErr w:type="spellStart"/>
+            <w:r>
+              <w:rPr>
+                <w:i/>
+                <w:sz w:val="24"/>
+                <w:lang w:val="en-US"/>
+              </w:rPr>
+              <w:t>efikasno</w:t>
+            </w:r>
+            <w:proofErr w:type="spellEnd"/>
+            <w:r>
+              <w:rPr>
+                <w:i/>
+                <w:sz w:val="24"/>
+                <w:lang w:val="en-US"/>
+              </w:rPr>
+              <w:t xml:space="preserve"> </w:t>
+            </w:r>
+            <w:proofErr w:type="spellStart"/>
+            <w:r>
+              <w:rPr>
+                <w:i/>
+                <w:sz w:val="24"/>
+                <w:lang w:val="en-US"/>
+              </w:rPr>
+              <w:t>skladištenje</w:t>
+            </w:r>
+            <w:proofErr w:type="spellEnd"/>
+            <w:r>
+              <w:rPr>
+                <w:i/>
+                <w:sz w:val="24"/>
+                <w:lang w:val="en-US"/>
+              </w:rPr>
+              <w:t xml:space="preserve"> </w:t>
+            </w:r>
+            <w:proofErr w:type="spellStart"/>
+            <w:r>
+              <w:rPr>
+                <w:i/>
+                <w:sz w:val="24"/>
+                <w:lang w:val="en-US"/>
+              </w:rPr>
+              <w:t>i</w:t>
+            </w:r>
+            <w:proofErr w:type="spellEnd"/>
+            <w:r>
+              <w:rPr>
+                <w:i/>
+                <w:sz w:val="24"/>
+                <w:lang w:val="en-US"/>
+              </w:rPr>
+              <w:t xml:space="preserve"> </w:t>
+            </w:r>
+            <w:proofErr w:type="spellStart"/>
+            <w:r>
+              <w:rPr>
+                <w:i/>
+                <w:sz w:val="24"/>
+                <w:lang w:val="en-US"/>
+              </w:rPr>
+              <w:t>agregaciju</w:t>
+            </w:r>
+            <w:proofErr w:type="spellEnd"/>
+            <w:r>
+              <w:rPr>
+                <w:i/>
+                <w:sz w:val="24"/>
+                <w:lang w:val="en-US"/>
+              </w:rPr>
+              <w:t xml:space="preserve"> </w:t>
+            </w:r>
+            <w:proofErr w:type="spellStart"/>
+            <w:r>
+              <w:rPr>
+                <w:i/>
+                <w:sz w:val="24"/>
+                <w:lang w:val="en-US"/>
+              </w:rPr>
+              <w:t>velikog</w:t>
+            </w:r>
+            <w:proofErr w:type="spellEnd"/>
+            <w:r>
+              <w:rPr>
+                <w:i/>
+                <w:sz w:val="24"/>
+                <w:lang w:val="en-US"/>
+              </w:rPr>
+              <w:t xml:space="preserve"> </w:t>
+            </w:r>
+            <w:proofErr w:type="spellStart"/>
+            <w:r>
+              <w:rPr>
+                <w:i/>
+                <w:sz w:val="24"/>
+                <w:lang w:val="en-US"/>
+              </w:rPr>
+              <w:t>broja</w:t>
+            </w:r>
+            <w:proofErr w:type="spellEnd"/>
+            <w:r>
+              <w:rPr>
+                <w:i/>
+                <w:sz w:val="24"/>
+                <w:lang w:val="en-US"/>
+              </w:rPr>
+              <w:t xml:space="preserve"> </w:t>
+            </w:r>
+            <w:proofErr w:type="spellStart"/>
+            <w:r>
+              <w:rPr>
+                <w:i/>
+                <w:sz w:val="24"/>
+                <w:lang w:val="en-US"/>
+              </w:rPr>
+              <w:t>događaja</w:t>
+            </w:r>
+            <w:proofErr w:type="spellEnd"/>
+            <w:r>
+              <w:rPr>
+                <w:i/>
+                <w:sz w:val="24"/>
+                <w:lang w:val="en-US"/>
+              </w:rPr>
+              <w:t xml:space="preserve"> </w:t>
+            </w:r>
+            <w:proofErr w:type="spellStart"/>
+            <w:r>
+              <w:rPr>
+                <w:i/>
+                <w:sz w:val="24"/>
+                <w:lang w:val="en-US"/>
+              </w:rPr>
+              <w:t>kroz</w:t>
+            </w:r>
+            <w:proofErr w:type="spellEnd"/>
+            <w:r>
+              <w:rPr>
+                <w:i/>
+                <w:sz w:val="24"/>
+                <w:lang w:val="en-US"/>
+              </w:rPr>
+              <w:t xml:space="preserve"> </w:t>
+            </w:r>
+            <w:proofErr w:type="spellStart"/>
+            <w:r>
+              <w:rPr>
+                <w:i/>
+                <w:sz w:val="24"/>
+                <w:lang w:val="en-US"/>
+              </w:rPr>
+              <w:t>vreme</w:t>
+            </w:r>
+            <w:proofErr w:type="spellEnd"/>
+            <w:r>
+              <w:rPr>
+                <w:i/>
+                <w:sz w:val="24"/>
+                <w:lang w:val="en-US"/>
+              </w:rPr>
+              <w:t xml:space="preserve">, </w:t>
+            </w:r>
+            <w:proofErr w:type="spellStart"/>
+            <w:r>
+              <w:rPr>
+                <w:i/>
+                <w:sz w:val="24"/>
+                <w:lang w:val="en-US"/>
+              </w:rPr>
+              <w:t>kao</w:t>
+            </w:r>
+            <w:proofErr w:type="spellEnd"/>
+            <w:r>
+              <w:rPr>
+                <w:i/>
+                <w:sz w:val="24"/>
+                <w:lang w:val="en-US"/>
+              </w:rPr>
+              <w:t xml:space="preserve"> </w:t>
+            </w:r>
+            <w:proofErr w:type="spellStart"/>
+            <w:r>
+              <w:rPr>
+                <w:i/>
+                <w:sz w:val="24"/>
+                <w:lang w:val="en-US"/>
+              </w:rPr>
+              <w:t>i</w:t>
+            </w:r>
+            <w:proofErr w:type="spellEnd"/>
+            <w:r>
+              <w:rPr>
+                <w:i/>
+                <w:sz w:val="24"/>
+                <w:lang w:val="en-US"/>
+              </w:rPr>
+              <w:t xml:space="preserve"> </w:t>
+            </w:r>
+            <w:proofErr w:type="spellStart"/>
+            <w:r>
+              <w:rPr>
+                <w:i/>
+                <w:sz w:val="24"/>
+                <w:lang w:val="en-US"/>
+              </w:rPr>
+              <w:t>izvršavanje</w:t>
+            </w:r>
+            <w:proofErr w:type="spellEnd"/>
+            <w:r>
+              <w:rPr>
+                <w:i/>
+                <w:sz w:val="24"/>
+                <w:lang w:val="en-US"/>
+              </w:rPr>
+              <w:t xml:space="preserve"> </w:t>
+            </w:r>
+            <w:proofErr w:type="spellStart"/>
+            <w:r>
+              <w:rPr>
+                <w:i/>
+                <w:sz w:val="24"/>
+                <w:lang w:val="en-US"/>
+              </w:rPr>
+              <w:t>analitičkih</w:t>
+            </w:r>
+            <w:proofErr w:type="spellEnd"/>
+            <w:r>
+              <w:rPr>
+                <w:i/>
+                <w:sz w:val="24"/>
+                <w:lang w:val="en-US"/>
+              </w:rPr>
+              <w:t xml:space="preserve"> </w:t>
+            </w:r>
+            <w:proofErr w:type="spellStart"/>
+            <w:r>
+              <w:rPr>
+                <w:i/>
+                <w:sz w:val="24"/>
+                <w:lang w:val="en-US"/>
+              </w:rPr>
+              <w:t>upita</w:t>
+            </w:r>
+            <w:proofErr w:type="spellEnd"/>
+            <w:r>
+              <w:rPr>
+                <w:i/>
+                <w:sz w:val="24"/>
+                <w:lang w:val="en-US"/>
+              </w:rPr>
+              <w:t xml:space="preserve"> </w:t>
+            </w:r>
+            <w:proofErr w:type="spellStart"/>
+            <w:r>
+              <w:rPr>
+                <w:i/>
+                <w:sz w:val="24"/>
+                <w:lang w:val="en-US"/>
+              </w:rPr>
+              <w:t>nad</w:t>
+            </w:r>
+            <w:proofErr w:type="spellEnd"/>
+            <w:r>
+              <w:rPr>
+                <w:i/>
+                <w:sz w:val="24"/>
+                <w:lang w:val="en-US"/>
+              </w:rPr>
+              <w:t xml:space="preserve"> </w:t>
+            </w:r>
+            <w:proofErr w:type="spellStart"/>
+            <w:r>
+              <w:rPr>
+                <w:i/>
+                <w:sz w:val="24"/>
+                <w:lang w:val="en-US"/>
+              </w:rPr>
+              <w:t>istorijskim</w:t>
+            </w:r>
+            <w:proofErr w:type="spellEnd"/>
+            <w:r>
+              <w:rPr>
+                <w:i/>
+                <w:sz w:val="24"/>
+                <w:lang w:val="en-US"/>
+              </w:rPr>
+              <w:t xml:space="preserve"> </w:t>
+            </w:r>
+            <w:proofErr w:type="spellStart"/>
+            <w:r>
+              <w:rPr>
+                <w:i/>
+                <w:sz w:val="24"/>
+                <w:lang w:val="en-US"/>
+              </w:rPr>
+              <w:t>podacima</w:t>
+            </w:r>
+            <w:proofErr w:type="spellEnd"/>
+            <w:r>
+              <w:rPr>
+                <w:i/>
+                <w:sz w:val="24"/>
+                <w:lang w:val="en-US"/>
+              </w:rPr>
+              <w:t>.</w:t>
+            </w:r>
+          </w:p>
+          <w:p>
+            <w:pPr>
+              <w:pStyle w:val="TableParagraph"/>
+              <w:numPr>
+                <w:ilvl w:val="1"/>
+                <w:numId w:val="1"/>
+              </w:numPr>
+              <w:tabs>
+                <w:tab w:val="left" w:pos="1525"/>
+              </w:tabs>
+              <w:spacing w:line="261" w:lineRule="auto"/>
+              <w:ind w:right="72"/>
+              <w:rPr>
+                <w:i/>
+                <w:sz w:val="24"/>
+                <w:lang w:val="en-US"/>
+              </w:rPr>
+            </w:pPr>
+            <w:proofErr w:type="spellStart"/>
+            <w:r>
+              <w:rPr>
+                <w:b/>
+                <w:bCs/>
+                <w:iCs/>
+                <w:sz w:val="24"/>
+                <w:lang w:val="en-US"/>
+              </w:rPr>
+              <w:t>Ključ-vrednost</w:t>
+            </w:r>
+            <w:proofErr w:type="spellEnd"/>
+            <w:r>
+              <w:rPr>
+                <w:b/>
+                <w:bCs/>
+                <w:iCs/>
+                <w:sz w:val="24"/>
+                <w:lang w:val="en-US"/>
+              </w:rPr>
+              <w:t xml:space="preserve"> </w:t>
+            </w:r>
+            <w:proofErr w:type="spellStart"/>
+            <w:r>
+              <w:rPr>
+                <w:b/>
+                <w:bCs/>
+                <w:iCs/>
+                <w:sz w:val="24"/>
+                <w:lang w:val="en-US"/>
+              </w:rPr>
+              <w:t>baza</w:t>
+            </w:r>
+            <w:proofErr w:type="spellEnd"/>
+            <w:r>
+              <w:rPr>
+                <w:b/>
+                <w:bCs/>
+                <w:iCs/>
+                <w:sz w:val="24"/>
+                <w:lang w:val="en-US"/>
+              </w:rPr>
+              <w:t xml:space="preserve"> </w:t>
+            </w:r>
+            <w:proofErr w:type="spellStart"/>
+            <w:r>
+              <w:rPr>
+                <w:b/>
+                <w:bCs/>
+                <w:iCs/>
+                <w:sz w:val="24"/>
+                <w:lang w:val="en-US"/>
+              </w:rPr>
+              <w:t>podataka</w:t>
+            </w:r>
+            <w:proofErr w:type="spellEnd"/>
+            <w:r>
+              <w:rPr>
+                <w:b/>
+                <w:bCs/>
+                <w:iCs/>
+                <w:sz w:val="24"/>
+                <w:lang w:val="en-US"/>
+              </w:rPr>
+              <w:t>:</w:t>
+            </w:r>
+            <w:r>
+              <w:rPr>
+                <w:i/>
+                <w:sz w:val="24"/>
+                <w:lang w:val="en-US"/>
+              </w:rPr>
+              <w:t xml:space="preserve"> </w:t>
+            </w:r>
+            <w:r>
+              <w:rPr>
+                <w:i/>
+                <w:sz w:val="24"/>
+                <w:lang w:val="en-US"/>
+              </w:rPr>
+              <w:t xml:space="preserve">Redis se </w:t>
+            </w:r>
+            <w:proofErr w:type="spellStart"/>
+            <w:r>
+              <w:rPr>
+                <w:i/>
+                <w:sz w:val="24"/>
+                <w:lang w:val="en-US"/>
+              </w:rPr>
+              <w:t>koristi</w:t>
+            </w:r>
+            <w:proofErr w:type="spellEnd"/>
+            <w:r>
+              <w:rPr>
+                <w:i/>
+                <w:sz w:val="24"/>
+                <w:lang w:val="en-US"/>
+              </w:rPr>
+              <w:t xml:space="preserve"> </w:t>
+            </w:r>
+            <w:proofErr w:type="spellStart"/>
+            <w:r>
+              <w:rPr>
+                <w:i/>
+                <w:sz w:val="24"/>
+                <w:lang w:val="en-US"/>
+              </w:rPr>
+              <w:t>kao</w:t>
+            </w:r>
+            <w:proofErr w:type="spellEnd"/>
+            <w:r>
+              <w:rPr>
+                <w:i/>
+                <w:sz w:val="24"/>
+                <w:lang w:val="en-US"/>
+              </w:rPr>
+              <w:t xml:space="preserve"> </w:t>
+            </w:r>
+            <w:proofErr w:type="spellStart"/>
+            <w:r>
+              <w:rPr>
+                <w:i/>
+                <w:sz w:val="24"/>
+                <w:lang w:val="en-US"/>
+              </w:rPr>
+              <w:t>keš</w:t>
+            </w:r>
+            <w:proofErr w:type="spellEnd"/>
+            <w:r>
+              <w:rPr>
+                <w:i/>
+                <w:sz w:val="24"/>
+                <w:lang w:val="en-US"/>
+              </w:rPr>
+              <w:t xml:space="preserve"> </w:t>
+            </w:r>
+            <w:proofErr w:type="spellStart"/>
+            <w:r>
+              <w:rPr>
+                <w:i/>
+                <w:sz w:val="24"/>
+                <w:lang w:val="en-US"/>
+              </w:rPr>
+              <w:t>sloj</w:t>
+            </w:r>
+            <w:proofErr w:type="spellEnd"/>
+            <w:r>
+              <w:rPr>
+                <w:i/>
+                <w:sz w:val="24"/>
+                <w:lang w:val="en-US"/>
+              </w:rPr>
+              <w:t xml:space="preserve"> za </w:t>
+            </w:r>
+            <w:proofErr w:type="spellStart"/>
+            <w:r>
+              <w:rPr>
+                <w:i/>
+                <w:sz w:val="24"/>
+                <w:lang w:val="en-US"/>
+              </w:rPr>
+              <w:t>rezultate</w:t>
+            </w:r>
+            <w:proofErr w:type="spellEnd"/>
+            <w:r>
+              <w:rPr>
+                <w:i/>
+                <w:sz w:val="24"/>
+                <w:lang w:val="en-US"/>
+              </w:rPr>
+              <w:t xml:space="preserve"> </w:t>
+            </w:r>
+            <w:proofErr w:type="spellStart"/>
+            <w:r>
+              <w:rPr>
+                <w:i/>
+                <w:sz w:val="24"/>
+                <w:lang w:val="en-US"/>
+              </w:rPr>
+              <w:t>često</w:t>
+            </w:r>
+            <w:proofErr w:type="spellEnd"/>
+            <w:r>
+              <w:rPr>
+                <w:i/>
+                <w:sz w:val="24"/>
+                <w:lang w:val="en-US"/>
+              </w:rPr>
+              <w:t xml:space="preserve"> </w:t>
+            </w:r>
+            <w:proofErr w:type="spellStart"/>
+            <w:r>
+              <w:rPr>
+                <w:i/>
+                <w:sz w:val="24"/>
+                <w:lang w:val="en-US"/>
+              </w:rPr>
+              <w:t>korišćenih</w:t>
+            </w:r>
+            <w:proofErr w:type="spellEnd"/>
+            <w:r>
+              <w:rPr>
+                <w:i/>
+                <w:sz w:val="24"/>
+                <w:lang w:val="en-US"/>
+              </w:rPr>
+              <w:t xml:space="preserve"> </w:t>
+            </w:r>
+            <w:proofErr w:type="spellStart"/>
+            <w:r>
+              <w:rPr>
+                <w:i/>
+                <w:sz w:val="24"/>
+                <w:lang w:val="en-US"/>
+              </w:rPr>
+              <w:t>analitičkih</w:t>
+            </w:r>
+            <w:proofErr w:type="spellEnd"/>
+            <w:r>
+              <w:rPr>
+                <w:i/>
+                <w:sz w:val="24"/>
+                <w:lang w:val="en-US"/>
+              </w:rPr>
+              <w:t xml:space="preserve"> </w:t>
+            </w:r>
+            <w:proofErr w:type="spellStart"/>
+            <w:r>
+              <w:rPr>
+                <w:i/>
+                <w:sz w:val="24"/>
+                <w:lang w:val="en-US"/>
+              </w:rPr>
+              <w:t>upita</w:t>
+            </w:r>
+            <w:proofErr w:type="spellEnd"/>
+            <w:r>
+              <w:rPr>
+                <w:i/>
+                <w:sz w:val="24"/>
+                <w:lang w:val="en-US"/>
+              </w:rPr>
+              <w:t xml:space="preserve">. Na taj </w:t>
+            </w:r>
+            <w:proofErr w:type="spellStart"/>
+            <w:r>
+              <w:rPr>
+                <w:i/>
+                <w:sz w:val="24"/>
+                <w:lang w:val="en-US"/>
+              </w:rPr>
+              <w:t>način</w:t>
+            </w:r>
+            <w:proofErr w:type="spellEnd"/>
+            <w:r>
+              <w:rPr>
+                <w:i/>
+                <w:sz w:val="24"/>
+                <w:lang w:val="en-US"/>
+              </w:rPr>
+              <w:t xml:space="preserve"> se </w:t>
+            </w:r>
+            <w:proofErr w:type="spellStart"/>
+            <w:r>
+              <w:rPr>
+                <w:i/>
+                <w:sz w:val="24"/>
+                <w:lang w:val="en-US"/>
+              </w:rPr>
+              <w:t>smanjuje</w:t>
+            </w:r>
+            <w:proofErr w:type="spellEnd"/>
+            <w:r>
+              <w:rPr>
+                <w:i/>
+                <w:sz w:val="24"/>
+                <w:lang w:val="en-US"/>
+              </w:rPr>
+              <w:t xml:space="preserve"> </w:t>
+            </w:r>
+            <w:proofErr w:type="spellStart"/>
+            <w:r>
+              <w:rPr>
+                <w:i/>
+                <w:sz w:val="24"/>
+                <w:lang w:val="en-US"/>
+              </w:rPr>
+              <w:t>broj</w:t>
+            </w:r>
+            <w:proofErr w:type="spellEnd"/>
+            <w:r>
+              <w:rPr>
+                <w:i/>
+                <w:sz w:val="24"/>
+                <w:lang w:val="en-US"/>
+              </w:rPr>
+              <w:t xml:space="preserve"> </w:t>
+            </w:r>
+            <w:proofErr w:type="spellStart"/>
+            <w:r>
+              <w:rPr>
+                <w:i/>
+                <w:sz w:val="24"/>
+                <w:lang w:val="en-US"/>
+              </w:rPr>
+              <w:t>pristupa</w:t>
+            </w:r>
+            <w:proofErr w:type="spellEnd"/>
+            <w:r>
+              <w:rPr>
+                <w:i/>
+                <w:sz w:val="24"/>
+                <w:lang w:val="en-US"/>
+              </w:rPr>
+              <w:t xml:space="preserve"> </w:t>
+            </w:r>
+            <w:proofErr w:type="spellStart"/>
+            <w:r>
+              <w:rPr>
+                <w:i/>
+                <w:sz w:val="24"/>
+                <w:lang w:val="en-US"/>
+              </w:rPr>
+              <w:t>InfluxDB</w:t>
+            </w:r>
+            <w:proofErr w:type="spellEnd"/>
+            <w:r>
+              <w:rPr>
+                <w:i/>
+                <w:sz w:val="24"/>
+                <w:lang w:val="en-US"/>
+              </w:rPr>
+              <w:t xml:space="preserve"> </w:t>
+            </w:r>
+            <w:proofErr w:type="spellStart"/>
+            <w:r>
+              <w:rPr>
+                <w:i/>
+                <w:sz w:val="24"/>
+                <w:lang w:val="en-US"/>
+              </w:rPr>
+              <w:t>bazi</w:t>
+            </w:r>
+            <w:proofErr w:type="spellEnd"/>
+            <w:r>
+              <w:rPr>
+                <w:i/>
+                <w:sz w:val="24"/>
+                <w:lang w:val="en-US"/>
+              </w:rPr>
+              <w:t xml:space="preserve"> </w:t>
+            </w:r>
+            <w:proofErr w:type="spellStart"/>
+            <w:r>
+              <w:rPr>
+                <w:i/>
+                <w:sz w:val="24"/>
+                <w:lang w:val="en-US"/>
+              </w:rPr>
+              <w:t>i</w:t>
+            </w:r>
+            <w:proofErr w:type="spellEnd"/>
+            <w:r>
+              <w:rPr>
+                <w:i/>
+                <w:sz w:val="24"/>
+                <w:lang w:val="en-US"/>
+              </w:rPr>
+              <w:t xml:space="preserve"> </w:t>
+            </w:r>
+            <w:proofErr w:type="spellStart"/>
+            <w:r>
+              <w:rPr>
+                <w:i/>
+                <w:sz w:val="24"/>
+                <w:lang w:val="en-US"/>
+              </w:rPr>
+              <w:t>ubrzava</w:t>
+            </w:r>
+            <w:proofErr w:type="spellEnd"/>
+            <w:r>
+              <w:rPr>
+                <w:i/>
+                <w:sz w:val="24"/>
+                <w:lang w:val="en-US"/>
+              </w:rPr>
+              <w:t xml:space="preserve"> </w:t>
+            </w:r>
+            <w:proofErr w:type="spellStart"/>
+            <w:r>
+              <w:rPr>
+                <w:i/>
+                <w:sz w:val="24"/>
+                <w:lang w:val="en-US"/>
+              </w:rPr>
+              <w:t>odziv</w:t>
+            </w:r>
+            <w:proofErr w:type="spellEnd"/>
+            <w:r>
+              <w:rPr>
+                <w:i/>
+                <w:sz w:val="24"/>
+                <w:lang w:val="en-US"/>
+              </w:rPr>
+              <w:t xml:space="preserve"> </w:t>
+            </w:r>
+            <w:proofErr w:type="spellStart"/>
+            <w:r>
+              <w:rPr>
+                <w:i/>
+                <w:sz w:val="24"/>
+                <w:lang w:val="en-US"/>
+              </w:rPr>
+              <w:t>sistema</w:t>
+            </w:r>
+            <w:proofErr w:type="spellEnd"/>
+            <w:r>
+              <w:rPr>
+                <w:i/>
+                <w:sz w:val="24"/>
+                <w:lang w:val="en-US"/>
+              </w:rPr>
+              <w:t xml:space="preserve">. </w:t>
+            </w:r>
+            <w:proofErr w:type="spellStart"/>
+            <w:r>
+              <w:rPr>
+                <w:i/>
+                <w:sz w:val="24"/>
+                <w:lang w:val="en-US"/>
+              </w:rPr>
+              <w:t>Rezultati</w:t>
+            </w:r>
+            <w:proofErr w:type="spellEnd"/>
+            <w:r>
+              <w:rPr>
+                <w:i/>
+                <w:sz w:val="24"/>
+                <w:lang w:val="en-US"/>
+              </w:rPr>
+              <w:t xml:space="preserve"> </w:t>
+            </w:r>
+            <w:proofErr w:type="spellStart"/>
+            <w:r>
+              <w:rPr>
+                <w:i/>
+                <w:sz w:val="24"/>
+                <w:lang w:val="en-US"/>
+              </w:rPr>
+              <w:t>analiza</w:t>
+            </w:r>
+            <w:proofErr w:type="spellEnd"/>
+            <w:r>
+              <w:rPr>
+                <w:i/>
+                <w:sz w:val="24"/>
+                <w:lang w:val="en-US"/>
+              </w:rPr>
+              <w:t xml:space="preserve">, </w:t>
+            </w:r>
+            <w:proofErr w:type="spellStart"/>
+            <w:r>
+              <w:rPr>
+                <w:i/>
+                <w:sz w:val="24"/>
+                <w:lang w:val="en-US"/>
+              </w:rPr>
+              <w:t>poput</w:t>
+            </w:r>
+            <w:proofErr w:type="spellEnd"/>
+            <w:r>
+              <w:rPr>
+                <w:i/>
+                <w:sz w:val="24"/>
+                <w:lang w:val="en-US"/>
+              </w:rPr>
+              <w:t xml:space="preserve"> </w:t>
+            </w:r>
+            <w:proofErr w:type="spellStart"/>
+            <w:r>
+              <w:rPr>
+                <w:i/>
+                <w:sz w:val="24"/>
+                <w:lang w:val="en-US"/>
+              </w:rPr>
+              <w:t>prosečnog</w:t>
+            </w:r>
+            <w:proofErr w:type="spellEnd"/>
+            <w:r>
+              <w:rPr>
+                <w:i/>
+                <w:sz w:val="24"/>
+                <w:lang w:val="en-US"/>
+              </w:rPr>
+              <w:t xml:space="preserve"> </w:t>
+            </w:r>
+            <w:proofErr w:type="spellStart"/>
+            <w:r>
+              <w:rPr>
+                <w:i/>
+                <w:sz w:val="24"/>
+                <w:lang w:val="en-US"/>
+              </w:rPr>
+              <w:t>trajanja</w:t>
+            </w:r>
+            <w:proofErr w:type="spellEnd"/>
+            <w:r>
+              <w:rPr>
+                <w:i/>
+                <w:sz w:val="24"/>
+                <w:lang w:val="en-US"/>
+              </w:rPr>
+              <w:t xml:space="preserve"> </w:t>
+            </w:r>
+            <w:proofErr w:type="spellStart"/>
+            <w:r>
+              <w:rPr>
+                <w:i/>
+                <w:sz w:val="24"/>
+                <w:lang w:val="en-US"/>
+              </w:rPr>
+              <w:t>faza</w:t>
+            </w:r>
+            <w:proofErr w:type="spellEnd"/>
+            <w:r>
+              <w:rPr>
+                <w:i/>
+                <w:sz w:val="24"/>
+                <w:lang w:val="en-US"/>
+              </w:rPr>
+              <w:t xml:space="preserve"> </w:t>
+            </w:r>
+            <w:proofErr w:type="spellStart"/>
+            <w:r>
+              <w:rPr>
+                <w:i/>
+                <w:sz w:val="24"/>
+                <w:lang w:val="en-US"/>
+              </w:rPr>
+              <w:t>prodajnog</w:t>
+            </w:r>
+            <w:proofErr w:type="spellEnd"/>
+            <w:r>
+              <w:rPr>
+                <w:i/>
+                <w:sz w:val="24"/>
+                <w:lang w:val="en-US"/>
+              </w:rPr>
+              <w:t xml:space="preserve"> </w:t>
+            </w:r>
+            <w:proofErr w:type="spellStart"/>
+            <w:r>
+              <w:rPr>
+                <w:i/>
+                <w:sz w:val="24"/>
+                <w:lang w:val="en-US"/>
+              </w:rPr>
+              <w:t>procesa</w:t>
+            </w:r>
+            <w:proofErr w:type="spellEnd"/>
+            <w:r>
+              <w:rPr>
+                <w:i/>
+                <w:sz w:val="24"/>
+                <w:lang w:val="en-US"/>
+              </w:rPr>
+              <w:t xml:space="preserve">, </w:t>
+            </w:r>
+            <w:proofErr w:type="spellStart"/>
+            <w:r>
+              <w:rPr>
+                <w:i/>
+                <w:sz w:val="24"/>
+                <w:lang w:val="en-US"/>
+              </w:rPr>
+              <w:t>privremeno</w:t>
+            </w:r>
+            <w:proofErr w:type="spellEnd"/>
+            <w:r>
+              <w:rPr>
+                <w:i/>
+                <w:sz w:val="24"/>
+                <w:lang w:val="en-US"/>
+              </w:rPr>
+              <w:t xml:space="preserve"> se </w:t>
+            </w:r>
+            <w:proofErr w:type="spellStart"/>
+            <w:r>
+              <w:rPr>
+                <w:i/>
+                <w:sz w:val="24"/>
+                <w:lang w:val="en-US"/>
+              </w:rPr>
+              <w:t>čuvaju</w:t>
+            </w:r>
+            <w:proofErr w:type="spellEnd"/>
+            <w:r>
+              <w:rPr>
+                <w:i/>
+                <w:sz w:val="24"/>
+                <w:lang w:val="en-US"/>
+              </w:rPr>
+              <w:t xml:space="preserve"> u Redis-u </w:t>
+            </w:r>
+            <w:proofErr w:type="spellStart"/>
+            <w:r>
+              <w:rPr>
+                <w:i/>
+                <w:sz w:val="24"/>
+                <w:lang w:val="en-US"/>
+              </w:rPr>
+              <w:t>i</w:t>
+            </w:r>
+            <w:proofErr w:type="spellEnd"/>
+            <w:r>
+              <w:rPr>
+                <w:i/>
+                <w:sz w:val="24"/>
+                <w:lang w:val="en-US"/>
+              </w:rPr>
+              <w:t xml:space="preserve"> </w:t>
+            </w:r>
+            <w:proofErr w:type="spellStart"/>
+            <w:r>
+              <w:rPr>
+                <w:i/>
+                <w:sz w:val="24"/>
+                <w:lang w:val="en-US"/>
+              </w:rPr>
+              <w:t>ponovo</w:t>
+            </w:r>
+            <w:proofErr w:type="spellEnd"/>
+            <w:r>
+              <w:rPr>
+                <w:i/>
+                <w:sz w:val="24"/>
+                <w:lang w:val="en-US"/>
+              </w:rPr>
+              <w:t xml:space="preserve"> </w:t>
+            </w:r>
+            <w:proofErr w:type="spellStart"/>
+            <w:r>
+              <w:rPr>
+                <w:i/>
+                <w:sz w:val="24"/>
+                <w:lang w:val="en-US"/>
+              </w:rPr>
+              <w:t>koriste</w:t>
+            </w:r>
+            <w:proofErr w:type="spellEnd"/>
+            <w:r>
+              <w:rPr>
+                <w:i/>
+                <w:sz w:val="24"/>
+                <w:lang w:val="en-US"/>
+              </w:rPr>
+              <w:t xml:space="preserve"> </w:t>
+            </w:r>
+            <w:proofErr w:type="spellStart"/>
+            <w:r>
+              <w:rPr>
+                <w:i/>
+                <w:sz w:val="24"/>
+                <w:lang w:val="en-US"/>
+              </w:rPr>
+              <w:t>prilikom</w:t>
+            </w:r>
+            <w:proofErr w:type="spellEnd"/>
+            <w:r>
+              <w:rPr>
+                <w:i/>
+                <w:sz w:val="24"/>
+                <w:lang w:val="en-US"/>
+              </w:rPr>
+              <w:t xml:space="preserve"> </w:t>
+            </w:r>
+            <w:proofErr w:type="spellStart"/>
+            <w:r>
+              <w:rPr>
+                <w:i/>
+                <w:sz w:val="24"/>
+                <w:lang w:val="en-US"/>
+              </w:rPr>
+              <w:t>narednih</w:t>
+            </w:r>
+            <w:proofErr w:type="spellEnd"/>
+            <w:r>
+              <w:rPr>
+                <w:i/>
+                <w:sz w:val="24"/>
+                <w:lang w:val="en-US"/>
+              </w:rPr>
+              <w:t xml:space="preserve"> </w:t>
+            </w:r>
+            <w:proofErr w:type="spellStart"/>
+            <w:r>
+              <w:rPr>
+                <w:i/>
+                <w:sz w:val="24"/>
+                <w:lang w:val="en-US"/>
+              </w:rPr>
+              <w:t>poziva</w:t>
+            </w:r>
+            <w:proofErr w:type="spellEnd"/>
+            <w:r>
+              <w:rPr>
+                <w:i/>
+                <w:sz w:val="24"/>
+                <w:lang w:val="en-US"/>
+              </w:rPr>
+              <w:t xml:space="preserve"> </w:t>
+            </w:r>
+            <w:proofErr w:type="spellStart"/>
+            <w:r>
+              <w:rPr>
+                <w:i/>
+                <w:sz w:val="24"/>
+                <w:lang w:val="en-US"/>
+              </w:rPr>
+              <w:t>istih</w:t>
+            </w:r>
+            <w:proofErr w:type="spellEnd"/>
+            <w:r>
+              <w:rPr>
+                <w:i/>
+                <w:sz w:val="24"/>
+                <w:lang w:val="en-US"/>
+              </w:rPr>
+              <w:t xml:space="preserve"> </w:t>
+            </w:r>
+            <w:proofErr w:type="spellStart"/>
+            <w:r>
+              <w:rPr>
+                <w:i/>
+                <w:sz w:val="24"/>
+                <w:lang w:val="en-US"/>
+              </w:rPr>
+              <w:t>upita</w:t>
+            </w:r>
+            <w:proofErr w:type="spellEnd"/>
+            <w:r>
+              <w:rPr>
+                <w:i/>
+                <w:sz w:val="24"/>
+                <w:lang w:val="en-US"/>
               </w:rPr>
               <w:t>.</w:t>
             </w:r>
@@ -2778,7 +5121,6 @@
                 <w:b/>
                 <w:spacing w:val="-2"/>
               </w:rPr>
-              <w:lastRenderedPageBreak/>
               <w:t>Student</w:t>
             </w:r>
           </w:p>
@@ -3015,6 +5357,7 @@
               <w:jc w:val="left"/>
               <w:rPr>
                 <w:i/>
+                <w:spacing w:val="-2"/>
                 <w:sz w:val="24"/>
               </w:rPr>
             </w:pPr>
@@ -3026,6 +5369,34 @@
               </w:rPr>
               <w:t>SalesProcessTrackingService</w:t>
             </w:r>
+            <w:r>
+              <w:rPr>
+                <w:i/>
+                <w:spacing w:val="-2"/>
+                <w:sz w:val="24"/>
+              </w:rPr>
+              <w:t>,</w:t>
+            </w:r>
+          </w:p>
+          <w:p>
+            <w:pPr>
+              <w:pStyle w:val="TableParagraph"/>
+              <w:rPr>
+                <w:i/>
+                <w:sz w:val="24"/>
+                <w:lang w:val="en-US"/>
+              </w:rPr>
+            </w:pPr>
+            <w:proofErr w:type="spellStart"/>
+            <w:r>
+              <w:rPr>
+                <w:i/>
+                <w:sz w:val="24"/>
+                <w:lang w:val="en-US"/>
+              </w:rPr>
+              <w:t>SalesAnalyticsService</w:t>
+            </w:r>
+            <w:proofErr w:type="spellEnd"/>
           </w:p>
         </w:tc>
         <w:tc>
@@ -3038,6 +5409,7 @@
               <w:jc w:val="left"/>
               <w:rPr>
                 <w:i/>
+                <w:spacing w:val="-2"/>
                 <w:sz w:val="24"/>
               </w:rPr>
             </w:pPr>
@@ -3085,6 +5457,55 @@
                 <w:sz w:val="24"/>
               </w:rPr>
               <w:t xml:space="preserve"> podataka)</w:t>
+            </w:r>
+          </w:p>
+          <w:p>
+            <w:pPr>
+              <w:pStyle w:val="TableParagraph"/>
+              <w:jc w:val="left"/>
+              <w:rPr>
+                <w:i/>
+                <w:sz w:val="24"/>
+              </w:rPr>
+            </w:pPr>
+            <w:r>
+              <w:rPr>
+                <w:i/>
+                <w:sz w:val="24"/>
+              </w:rPr>
+              <w:t>InfluxDB (baza podataka vremenskih nizova)</w:t>
+            </w:r>
+          </w:p>
+          <w:p>
+            <w:pPr>
+              <w:pStyle w:val="TableParagraph"/>
+              <w:jc w:val="left"/>
+              <w:rPr>
+                <w:i/>
+                <w:sz w:val="24"/>
+              </w:rPr>
+            </w:pPr>
+            <w:r>
+              <w:rPr>
+                <w:i/>
+                <w:sz w:val="24"/>
+              </w:rPr>
+              <w:t>Redis (baza podataka tipa klju</w:t>
+            </w:r>
+            <w:r>
+              <w:rPr>
+                <w:i/>
+                <w:sz w:val="24"/>
+                <w:lang w:val="sr-Latn-RS"/>
+              </w:rPr>
+              <w:t>č-vrednost</w:t>
+            </w:r>
+            <w:r>
+              <w:rPr>
+                <w:i/>
+                <w:sz w:val="24"/>
+              </w:rPr>
+              <w:t>)</w:t>
             </w:r>
           </w:p>
         </w:tc>
@@ -3259,6 +5680,7 @@
               <w:rPr>
                 <w:i/>
                 <w:sz w:val="24"/>
+                <w:lang w:val="sr-Latn-RS"/>
               </w:rPr>
             </w:pPr>
             <w:r>
@@ -3266,7 +5688,22 @@
                 <w:i/>
                 <w:sz w:val="24"/>
               </w:rPr>
-              <w:t>Ognjen Damnjanović</w:t>
+              <w:t>Ognjen Damnjanov</w:t>
+            </w:r>
+            <w:r>
+              <w:rPr>
+                <w:i/>
+                <w:sz w:val="24"/>
+              </w:rPr>
+              <w:t>i</w:t>
+            </w:r>
+            <w:r>
+              <w:rPr>
+                <w:i/>
+                <w:sz w:val="24"/>
+                <w:lang w:val="sr-Latn-RS"/>
+              </w:rPr>
+              <w:t>ć</w:t>
             </w:r>
           </w:p>
         </w:tc>
@@ -3352,8 +5789,6 @@
               </w:rPr>
               <w:t xml:space="preserve"> podataka)</w:t>
             </w:r>
-            <w:bookmarkStart w:id="0" w:name="_GoBack"/>
-            <w:bookmarkEnd w:id="0"/>
           </w:p>
         </w:tc>
       </w:tr>
@@ -3361,6 +5796,7 @@
     <w:p>
       <w:pPr>
         <w:pStyle w:val="TableParagraph"/>
+        <w:ind w:left="0"/>
         <w:jc w:val="left"/>
         <w:rPr>
           <w:i/>
@@ -3373,169 +5809,6 @@
         </w:sectPr>
       </w:pPr>
     </w:p>
-    <w:tbl>
-      <w:tblPr>
-        <w:tblW w:w="11655" w:type="dxa"/>
-        <w:tblInd w:w="297" w:type="dxa"/>
-        <w:tblBorders>
-          <w:top w:val="single" w:sz="4" w:space="0" w:color="7F7F7F"/>
-          <w:left w:val="single" w:sz="4" w:space="0" w:color="7F7F7F"/>
-          <w:bottom w:val="single" w:sz="4" w:space="0" w:color="7F7F7F"/>
-          <w:right w:val="single" w:sz="4" w:space="0" w:color="7F7F7F"/>
-          <w:insideH w:val="single" w:sz="4" w:space="0" w:color="7F7F7F"/>
-          <w:insideV w:val="single" w:sz="4" w:space="0" w:color="7F7F7F"/>
-        </w:tblBorders>
-        <w:tblLayout w:type="fixed"/>
-        <w:tblCellMar>
-          <w:left w:w="0" w:type="dxa"/>
-          <w:right w:w="0" w:type="dxa"/>
-        </w:tblCellMar>
-        <w:tblLook w:val="01E0" w:firstRow="1" w:lastRow="1" w:firstColumn="1" w:lastColumn="1" w:noHBand="0" w:noVBand="0"/>
-      </w:tblPr>
-      <w:tblGrid>
-        <w:gridCol w:w="3885"/>
-        <w:gridCol w:w="3885"/>
-        <w:gridCol w:w="3885"/>
-      </w:tblGrid>
-      <w:tr>
-        <w:trPr>
-          <w:trHeight w:val="449"/>
-        </w:trPr>
-        <w:tc>
-          <w:tcPr>
-            <w:tcW w:w="3885" w:type="dxa"/>
-          </w:tcPr>
-          <w:p>
-            <w:pPr>
-              <w:pStyle w:val="TableParagraph"/>
-              <w:spacing w:before="57"/>
-              <w:jc w:val="left"/>
-              <w:rPr>
-                <w:i/>
-              </w:rPr>
-            </w:pPr>
-            <w:r>
-              <w:rPr>
-                <w:i/>
-              </w:rPr>
-              <w:lastRenderedPageBreak/>
-              <w:t>O</w:t>
-            </w:r>
-            <w:r>
-              <w:rPr>
-                <w:i/>
-              </w:rPr>
-              <w:t>gnjen</w:t>
-            </w:r>
-            <w:r>
-              <w:rPr>
-                <w:i/>
-                <w:spacing w:val="-3"/>
-              </w:rPr>
-              <w:t xml:space="preserve"> </w:t>
-            </w:r>
-            <w:r>
-              <w:rPr>
-                <w:i/>
-                <w:spacing w:val="-2"/>
-              </w:rPr>
-              <w:t>Damnjanović</w:t>
-            </w:r>
-          </w:p>
-        </w:tc>
-        <w:tc>
-          <w:tcPr>
-            <w:tcW w:w="3885" w:type="dxa"/>
-          </w:tcPr>
-          <w:p>
-            <w:pPr>
-              <w:pStyle w:val="TableParagraph"/>
-              <w:jc w:val="left"/>
-              <w:rPr>
-                <w:i/>
-                <w:sz w:val="24"/>
-              </w:rPr>
-            </w:pPr>
-            <w:r>
-              <w:rPr>
-                <w:i/>
-                <w:spacing w:val="-2"/>
-                <w:sz w:val="24"/>
-              </w:rPr>
-              <w:t>ProductPortfolioService</w:t>
-            </w:r>
-          </w:p>
-        </w:tc>
-        <w:tc>
-          <w:tcPr>
-            <w:tcW w:w="3885" w:type="dxa"/>
-          </w:tcPr>
-          <w:p>
-            <w:pPr>
-              <w:pStyle w:val="TableParagraph"/>
-              <w:jc w:val="left"/>
-              <w:rPr>
-                <w:i/>
-                <w:sz w:val="24"/>
-              </w:rPr>
-            </w:pPr>
-            <w:r>
-              <w:rPr>
-                <w:i/>
-                <w:sz w:val="24"/>
-              </w:rPr>
-              <w:t>Neo4j</w:t>
-            </w:r>
-            <w:r>
-              <w:rPr>
-                <w:i/>
-                <w:spacing w:val="-2"/>
-                <w:sz w:val="24"/>
-              </w:rPr>
-              <w:t xml:space="preserve"> </w:t>
-            </w:r>
-            <w:r>
-              <w:rPr>
-                <w:i/>
-                <w:sz w:val="24"/>
-              </w:rPr>
-              <w:t>(Grafskа</w:t>
-            </w:r>
-            <w:r>
-              <w:rPr>
-                <w:i/>
-                <w:spacing w:val="-2"/>
-                <w:sz w:val="24"/>
-              </w:rPr>
-              <w:t xml:space="preserve"> </w:t>
-            </w:r>
-            <w:r>
-              <w:rPr>
-                <w:i/>
-                <w:sz w:val="24"/>
-              </w:rPr>
-              <w:t>baza</w:t>
-            </w:r>
-            <w:r>
-              <w:rPr>
-                <w:i/>
-                <w:spacing w:val="-1"/>
-                <w:sz w:val="24"/>
-              </w:rPr>
-              <w:t xml:space="preserve"> </w:t>
-            </w:r>
-            <w:r>
-              <w:rPr>
-                <w:i/>
-                <w:spacing w:val="-2"/>
-                <w:sz w:val="24"/>
-              </w:rPr>
-              <w:t>podataka)</w:t>
-            </w:r>
-          </w:p>
-        </w:tc>
-      </w:tr>
-    </w:tbl>
     <w:p/>
     <w:sectPr>
       <w:pgSz w:w="12240" w:h="15840"/>
@@ -3547,7 +5820,7 @@
 </file>
 
 <file path=word/numbering.xml><?xml version="1.0" encoding="utf-8"?>
-<w:numbering xmlns:wpc="http://schemas.microsoft.com/office/word/2010/wordprocessingCanvas" xmlns:cx="http://schemas.microsoft.com/office/drawing/2014/chartex" xmlns:cx1="http://schemas.microsoft.com/office/drawing/2015/9/8/chartex" xmlns:cx2="http://schemas.microsoft.com/office/drawing/2015/10/21/chartex" xmlns:cx3="http://schemas.microsoft.com/office/drawing/2016/5/9/chartex" xmlns:cx4="http://schemas.microsoft.com/office/drawing/2016/5/10/chartex" xmlns:cx5="http://schemas.microsoft.com/office/drawing/2016/5/11/chartex" xmlns:cx6="http://schemas.microsoft.com/office/drawing/2016/5/12/chartex" xmlns:cx7="http://schemas.microsoft.com/office/drawing/2016/5/13/chartex" xmlns:cx8="http://schemas.microsoft.com/office/drawing/2016/5/14/chartex" xmlns:mc="http://schemas.openxmlformats.org/markup-compatibility/2006" xmlns:aink="http://schemas.microsoft.com/office/drawing/2016/ink" xmlns:am3d="http://schemas.microsoft.com/office/drawing/2017/model3d" xmlns:o="urn:schemas-microsoft-com:office:office" xmlns:r="http://schemas.openxmlformats.org/officeDocument/2006/relationships" xmlns:m="http://schemas.openxmlformats.org/officeDocument/2006/math" xmlns:v="urn:schemas-microsoft-com:vml" xmlns:wp14="http://schemas.microsoft.com/office/word/2010/wordprocessingDrawing" xmlns:wp="http://schemas.openxmlformats.org/drawingml/2006/wordprocessingDrawing" xmlns:w10="urn:schemas-microsoft-com:office:word" xmlns:w="http://schemas.openxmlformats.org/wordprocessingml/2006/main" xmlns:w14="http://schemas.microsoft.com/office/word/2010/wordml" xmlns:w15="http://schemas.microsoft.com/office/word/2012/wordml" xmlns:w16cid="http://schemas.microsoft.com/office/word/2016/wordml/cid" xmlns:w16se="http://schemas.microsoft.com/office/word/2015/wordml/symex" xmlns:wpg="http://schemas.microsoft.com/office/word/2010/wordprocessingGroup" xmlns:wpi="http://schemas.microsoft.com/office/word/2010/wordprocessingInk" xmlns:wne="http://schemas.microsoft.com/office/word/2006/wordml" xmlns:wps="http://schemas.microsoft.com/office/word/2010/wordprocessingShape" mc:Ignorable="w14 w15 w16se w16cid wp14">
+<w:numbering xmlns:wpc="http://schemas.microsoft.com/office/word/2010/wordprocessingCanvas" xmlns:cx="http://schemas.microsoft.com/office/drawing/2014/chartex" xmlns:cx1="http://schemas.microsoft.com/office/drawing/2015/9/8/chartex" xmlns:cx2="http://schemas.microsoft.com/office/drawing/2015/10/21/chartex" xmlns:cx3="http://schemas.microsoft.com/office/drawing/2016/5/9/chartex" xmlns:cx4="http://schemas.microsoft.com/office/drawing/2016/5/10/chartex" xmlns:cx5="http://schemas.microsoft.com/office/drawing/2016/5/11/chartex" xmlns:cx6="http://schemas.microsoft.com/office/drawing/2016/5/12/chartex" xmlns:cx7="http://schemas.microsoft.com/office/drawing/2016/5/13/chartex" xmlns:cx8="http://schemas.microsoft.com/office/drawing/2016/5/14/chartex" xmlns:mc="http://schemas.openxmlformats.org/markup-compatibility/2006" xmlns:aink="http://schemas.microsoft.com/office/drawing/2016/ink" xmlns:am3d="http://schemas.microsoft.com/office/drawing/2017/model3d" xmlns:o="urn:schemas-microsoft-com:office:office" xmlns:oel="http://schemas.microsoft.com/office/2019/extlst" xmlns:r="http://schemas.openxmlformats.org/officeDocument/2006/relationships" xmlns:m="http://schemas.openxmlformats.org/officeDocument/2006/math" xmlns:v="urn:schemas-microsoft-com:vml" xmlns:wp14="http://schemas.microsoft.com/office/word/2010/wordprocessingDrawing" xmlns:wp="http://schemas.openxmlformats.org/drawingml/2006/wordprocessingDrawing" xmlns:w10="urn:schemas-microsoft-com:office:word" xmlns:w="http://schemas.openxmlformats.org/wordprocessingml/2006/main" xmlns:w14="http://schemas.microsoft.com/office/word/2010/wordml" xmlns:w15="http://schemas.microsoft.com/office/word/2012/wordml" xmlns:w16cex="http://schemas.microsoft.com/office/word/2018/wordml/cex" xmlns:w16cid="http://schemas.microsoft.com/office/word/2016/wordml/cid" xmlns:w16="http://schemas.microsoft.com/office/word/2018/wordml" xmlns:w16du="http://schemas.microsoft.com/office/word/2023/wordml/word16du" xmlns:w16sdtdh="http://schemas.microsoft.com/office/word/2020/wordml/sdtdatahash" xmlns:w16sdtfl="http://schemas.microsoft.com/office/word/2024/wordml/sdtformatlock" xmlns:w16se="http://schemas.microsoft.com/office/word/2015/wordml/symex" xmlns:wpg="http://schemas.microsoft.com/office/word/2010/wordprocessingGroup" xmlns:wpi="http://schemas.microsoft.com/office/word/2010/wordprocessingInk" xmlns:wne="http://schemas.microsoft.com/office/word/2006/wordml" xmlns:wps="http://schemas.microsoft.com/office/word/2010/wordprocessingShape" mc:Ignorable="w14 w15 w16se w16cid w16 w16cex w16sdtdh w16sdtfl w16du wp14">
   <w:abstractNum w:abstractNumId="0" w15:restartNumberingAfterBreak="0">
     <w:nsid w:val="35301E8D"/>
     <w:multiLevelType w:val="hybridMultilevel"/>
@@ -3673,7 +5946,7 @@
   <w:abstractNum w:abstractNumId="1" w15:restartNumberingAfterBreak="0">
     <w:nsid w:val="4D6E28AF"/>
     <w:multiLevelType w:val="hybridMultilevel"/>
-    <w:tmpl w:val="DF484FA8"/>
+    <w:tmpl w:val="17B612C8"/>
     <w:lvl w:ilvl="0" w:tplc="3C6A140E">
       <w:numFmt w:val="bullet"/>
       <w:lvlText w:val=""/>
@@ -3801,17 +6074,118 @@
       </w:rPr>
     </w:lvl>
   </w:abstractNum>
-  <w:num w:numId="1">
+  <w:abstractNum w:abstractNumId="2" w15:restartNumberingAfterBreak="0">
+    <w:nsid w:val="78813C92"/>
+    <w:multiLevelType w:val="hybridMultilevel"/>
+    <w:tmpl w:val="A44C9C98"/>
+    <w:lvl w:ilvl="0" w:tplc="C6764EDA">
+      <w:numFmt w:val="bullet"/>
+      <w:lvlText w:val="o"/>
+      <w:lvlJc w:val="left"/>
+      <w:pPr>
+        <w:ind w:left="1525" w:hanging="360"/>
+      </w:pPr>
+      <w:rPr>
+        <w:rFonts w:ascii="Courier New" w:eastAsia="Courier New" w:hAnsi="Courier New" w:cs="Courier New" w:hint="default"/>
+        <w:b w:val="0"/>
+        <w:bCs w:val="0"/>
+        <w:i w:val="0"/>
+        <w:iCs w:val="0"/>
+        <w:spacing w:val="0"/>
+        <w:w w:val="100"/>
+        <w:position w:val="3"/>
+        <w:sz w:val="24"/>
+        <w:szCs w:val="24"/>
+        <w:lang w:val="bs" w:eastAsia="en-US" w:bidi="ar-SA"/>
+      </w:rPr>
+    </w:lvl>
+    <w:lvl w:ilvl="1" w:tplc="04090019" w:tentative="1">
+      <w:start w:val="1"/>
+      <w:numFmt w:val="lowerLetter"/>
+      <w:lvlText w:val="%2."/>
+      <w:lvlJc w:val="left"/>
+      <w:pPr>
+        <w:ind w:left="1524" w:hanging="360"/>
+      </w:pPr>
+    </w:lvl>
+    <w:lvl w:ilvl="2" w:tplc="0409001B" w:tentative="1">
+      <w:start w:val="1"/>
+      <w:numFmt w:val="lowerRoman"/>
+      <w:lvlText w:val="%3."/>
+      <w:lvlJc w:val="right"/>
+      <w:pPr>
+        <w:ind w:left="2244" w:hanging="180"/>
+      </w:pPr>
+    </w:lvl>
+    <w:lvl w:ilvl="3" w:tplc="0409000F" w:tentative="1">
+      <w:start w:val="1"/>
+      <w:numFmt w:val="decimal"/>
+      <w:lvlText w:val="%4."/>
+      <w:lvlJc w:val="left"/>
+      <w:pPr>
+        <w:ind w:left="2964" w:hanging="360"/>
+      </w:pPr>
+    </w:lvl>
+    <w:lvl w:ilvl="4" w:tplc="04090019" w:tentative="1">
+      <w:start w:val="1"/>
+      <w:numFmt w:val="lowerLetter"/>
+      <w:lvlText w:val="%5."/>
+      <w:lvlJc w:val="left"/>
+      <w:pPr>
+        <w:ind w:left="3684" w:hanging="360"/>
+      </w:pPr>
+    </w:lvl>
+    <w:lvl w:ilvl="5" w:tplc="0409001B" w:tentative="1">
+      <w:start w:val="1"/>
+      <w:numFmt w:val="lowerRoman"/>
+      <w:lvlText w:val="%6."/>
+      <w:lvlJc w:val="right"/>
+      <w:pPr>
+        <w:ind w:left="4404" w:hanging="180"/>
+      </w:pPr>
+    </w:lvl>
+    <w:lvl w:ilvl="6" w:tplc="0409000F" w:tentative="1">
+      <w:start w:val="1"/>
+      <w:numFmt w:val="decimal"/>
+      <w:lvlText w:val="%7."/>
+      <w:lvlJc w:val="left"/>
+      <w:pPr>
+        <w:ind w:left="5124" w:hanging="360"/>
+      </w:pPr>
+    </w:lvl>
+    <w:lvl w:ilvl="7" w:tplc="04090019" w:tentative="1">
+      <w:start w:val="1"/>
+      <w:numFmt w:val="lowerLetter"/>
+      <w:lvlText w:val="%8."/>
+      <w:lvlJc w:val="left"/>
+      <w:pPr>
+        <w:ind w:left="5844" w:hanging="360"/>
+      </w:pPr>
+    </w:lvl>
+    <w:lvl w:ilvl="8" w:tplc="0409001B" w:tentative="1">
+      <w:start w:val="1"/>
+      <w:numFmt w:val="lowerRoman"/>
+      <w:lvlText w:val="%9."/>
+      <w:lvlJc w:val="right"/>
+      <w:pPr>
+        <w:ind w:left="6564" w:hanging="180"/>
+      </w:pPr>
+    </w:lvl>
+  </w:abstractNum>
+  <w:num w:numId="1" w16cid:durableId="296687425">
     <w:abstractNumId w:val="1"/>
   </w:num>
-  <w:num w:numId="2">
+  <w:num w:numId="2" w16cid:durableId="758137541">
     <w:abstractNumId w:val="0"/>
+  </w:num>
+  <w:num w:numId="3" w16cid:durableId="1143233264">
+    <w:abstractNumId w:val="2"/>
   </w:num>
 </w:numbering>
 </file>
 
 <file path=word/styles.xml><?xml version="1.0" encoding="utf-8"?>
-<w:styles xmlns:mc="http://schemas.openxmlformats.org/markup-compatibility/2006" xmlns:r="http://schemas.openxmlformats.org/officeDocument/2006/relationships" xmlns:w="http://schemas.openxmlformats.org/wordprocessingml/2006/main" xmlns:w14="http://schemas.microsoft.com/office/word/2010/wordml" xmlns:w15="http://schemas.microsoft.com/office/word/2012/wordml" xmlns:w16cid="http://schemas.microsoft.com/office/word/2016/wordml/cid" xmlns:w16se="http://schemas.microsoft.com/office/word/2015/wordml/symex" mc:Ignorable="w14 w15 w16se w16cid">
+<w:styles xmlns:mc="http://schemas.openxmlformats.org/markup-compatibility/2006" xmlns:r="http://schemas.openxmlformats.org/officeDocument/2006/relationships" xmlns:w="http://schemas.openxmlformats.org/wordprocessingml/2006/main" xmlns:w14="http://schemas.microsoft.com/office/word/2010/wordml" xmlns:w15="http://schemas.microsoft.com/office/word/2012/wordml" xmlns:w16cex="http://schemas.microsoft.com/office/word/2018/wordml/cex" xmlns:w16cid="http://schemas.microsoft.com/office/word/2016/wordml/cid" xmlns:w16="http://schemas.microsoft.com/office/word/2018/wordml" xmlns:w16du="http://schemas.microsoft.com/office/word/2023/wordml/word16du" xmlns:w16sdtdh="http://schemas.microsoft.com/office/word/2020/wordml/sdtdatahash" xmlns:w16sdtfl="http://schemas.microsoft.com/office/word/2024/wordml/sdtformatlock" xmlns:w16se="http://schemas.microsoft.com/office/word/2015/wordml/symex" mc:Ignorable="w14 w15 w16se w16cid w16 w16cex w16sdtdh w16sdtfl w16du">
   <w:docDefaults>
     <w:rPrDefault>
       <w:rPr>
@@ -3829,7 +6203,7 @@
       </w:pPr>
     </w:pPrDefault>
   </w:docDefaults>
-  <w:latentStyles w:defLockedState="0" w:defUIPriority="99" w:defSemiHidden="0" w:defUnhideWhenUsed="0" w:defQFormat="0" w:count="375">
+  <w:latentStyles w:defLockedState="0" w:defUIPriority="99" w:defSemiHidden="0" w:defUnhideWhenUsed="0" w:defQFormat="0" w:count="376">
     <w:lsdException w:name="Normal" w:uiPriority="0" w:qFormat="1"/>
     <w:lsdException w:name="heading 1" w:uiPriority="9" w:qFormat="1"/>
     <w:lsdException w:name="heading 2" w:semiHidden="1" w:uiPriority="9" w:unhideWhenUsed="1" w:qFormat="1"/>
@@ -4205,6 +6579,7 @@
     <w:lsdException w:name="Smart Hyperlink" w:semiHidden="1" w:unhideWhenUsed="1"/>
     <w:lsdException w:name="Hashtag" w:semiHidden="1" w:unhideWhenUsed="1"/>
     <w:lsdException w:name="Unresolved Mention" w:semiHidden="1" w:unhideWhenUsed="1"/>
+    <w:lsdException w:name="Smart Link" w:semiHidden="1" w:unhideWhenUsed="1"/>
   </w:latentStyles>
   <w:style w:type="paragraph" w:default="1" w:styleId="Normal">
     <w:name w:val="Normal"/>
@@ -4229,10 +6604,32 @@
       <w:szCs w:val="24"/>
     </w:rPr>
   </w:style>
+  <w:style w:type="paragraph" w:styleId="Heading3">
+    <w:name w:val="heading 3"/>
+    <w:basedOn w:val="Normal"/>
+    <w:next w:val="Normal"/>
+    <w:link w:val="Heading3Char"/>
+    <w:uiPriority w:val="9"/>
+    <w:semiHidden/>
+    <w:unhideWhenUsed/>
+    <w:qFormat/>
+    <w:rsid w:val="00BA7954"/>
+    <w:pPr>
+      <w:keepNext/>
+      <w:keepLines/>
+      <w:spacing w:before="40"/>
+      <w:outlineLvl w:val="2"/>
+    </w:pPr>
+    <w:rPr>
+      <w:rFonts w:asciiTheme="majorHAnsi" w:eastAsiaTheme="majorEastAsia" w:hAnsiTheme="majorHAnsi" w:cstheme="majorBidi"/>
+      <w:color w:val="243F60" w:themeColor="accent1" w:themeShade="7F"/>
+      <w:sz w:val="24"/>
+      <w:szCs w:val="24"/>
+    </w:rPr>
+  </w:style>
   <w:style w:type="character" w:default="1" w:styleId="DefaultParagraphFont">
     <w:name w:val="Default Paragraph Font"/>
     <w:uiPriority w:val="1"/>
-    <w:semiHidden/>
     <w:unhideWhenUsed/>
   </w:style>
   <w:style w:type="table" w:default="1" w:styleId="TableNormal">
@@ -4302,6 +6699,21 @@
       <w:ind w:left="84"/>
       <w:jc w:val="both"/>
     </w:pPr>
+  </w:style>
+  <w:style w:type="character" w:customStyle="1" w:styleId="Heading3Char">
+    <w:name w:val="Heading 3 Char"/>
+    <w:basedOn w:val="DefaultParagraphFont"/>
+    <w:link w:val="Heading3"/>
+    <w:uiPriority w:val="9"/>
+    <w:semiHidden/>
+    <w:rsid w:val="00BA7954"/>
+    <w:rPr>
+      <w:rFonts w:asciiTheme="majorHAnsi" w:eastAsiaTheme="majorEastAsia" w:hAnsiTheme="majorHAnsi" w:cstheme="majorBidi"/>
+      <w:color w:val="243F60" w:themeColor="accent1" w:themeShade="7F"/>
+      <w:sz w:val="24"/>
+      <w:szCs w:val="24"/>
+      <w:lang w:val="bs"/>
+    </w:rPr>
   </w:style>
 </w:styles>
 </file>

</xml_diff>

<commit_message>
Implement saga transaction processing and PDF reporting
</commit_message>
<xml_diff>
--- a/NAIS_SpecifikacijaProjekta_RA_Tim3.docx
+++ b/NAIS_SpecifikacijaProjekta_RA_Tim3.docx
@@ -1,8 +1,8 @@
 
 <file path=word/document.xml><?xml version="1.0" encoding="utf-8"?>
-<w:document xmlns:wpc="http://schemas.microsoft.com/office/word/2010/wordprocessingCanvas" xmlns:cx="http://schemas.microsoft.com/office/drawing/2014/chartex" xmlns:cx1="http://schemas.microsoft.com/office/drawing/2015/9/8/chartex" xmlns:cx2="http://schemas.microsoft.com/office/drawing/2015/10/21/chartex" xmlns:cx3="http://schemas.microsoft.com/office/drawing/2016/5/9/chartex" xmlns:cx4="http://schemas.microsoft.com/office/drawing/2016/5/10/chartex" xmlns:cx5="http://schemas.microsoft.com/office/drawing/2016/5/11/chartex" xmlns:cx6="http://schemas.microsoft.com/office/drawing/2016/5/12/chartex" xmlns:cx7="http://schemas.microsoft.com/office/drawing/2016/5/13/chartex" xmlns:cx8="http://schemas.microsoft.com/office/drawing/2016/5/14/chartex" xmlns:mc="http://schemas.openxmlformats.org/markup-compatibility/2006" xmlns:aink="http://schemas.microsoft.com/office/drawing/2016/ink" xmlns:am3d="http://schemas.microsoft.com/office/drawing/2017/model3d" xmlns:o="urn:schemas-microsoft-com:office:office" xmlns:oel="http://schemas.microsoft.com/office/2019/extlst" xmlns:r="http://schemas.openxmlformats.org/officeDocument/2006/relationships" xmlns:m="http://schemas.openxmlformats.org/officeDocument/2006/math" xmlns:v="urn:schemas-microsoft-com:vml" xmlns:wp14="http://schemas.microsoft.com/office/word/2010/wordprocessingDrawing" xmlns:wp="http://schemas.openxmlformats.org/drawingml/2006/wordprocessingDrawing" xmlns:w10="urn:schemas-microsoft-com:office:word" xmlns:w="http://schemas.openxmlformats.org/wordprocessingml/2006/main" xmlns:w14="http://schemas.microsoft.com/office/word/2010/wordml" xmlns:w15="http://schemas.microsoft.com/office/word/2012/wordml" xmlns:w16cex="http://schemas.microsoft.com/office/word/2018/wordml/cex" xmlns:w16cid="http://schemas.microsoft.com/office/word/2016/wordml/cid" xmlns:w16="http://schemas.microsoft.com/office/word/2018/wordml" xmlns:w16du="http://schemas.microsoft.com/office/word/2023/wordml/word16du" xmlns:w16sdtdh="http://schemas.microsoft.com/office/word/2020/wordml/sdtdatahash" xmlns:w16sdtfl="http://schemas.microsoft.com/office/word/2024/wordml/sdtformatlock" xmlns:w16se="http://schemas.microsoft.com/office/word/2015/wordml/symex" xmlns:wpg="http://schemas.microsoft.com/office/word/2010/wordprocessingGroup" xmlns:wpi="http://schemas.microsoft.com/office/word/2010/wordprocessingInk" xmlns:wne="http://schemas.microsoft.com/office/word/2006/wordml" xmlns:wps="http://schemas.microsoft.com/office/word/2010/wordprocessingShape" mc:Ignorable="w14 w15 w16se w16cid w16 w16cex w16sdtdh w16sdtfl w16du wp14">
+<w:document xmlns:ns1="http://schemas.openxmlformats.org/markup-compatibility/2006" xmlns:ns2="http://schemas.microsoft.com/office/word/2010/wordml" xmlns:w="http://schemas.openxmlformats.org/wordprocessingml/2006/main" ns1:Ignorable="w14 w15 w16se w16cid w16 w16cex w16sdtdh w16sdtfl w16du wp14">
   <w:body>
-    <w:p>
+    <w:p ns2:paraId="6A30DEED" ns2:textId="77777777">
       <w:pPr>
         <w:pStyle w:val="BodyText"/>
         <w:tabs>
@@ -70,7 +70,7 @@
         <w:t>studije</w:t>
       </w:r>
     </w:p>
-    <w:p>
+    <w:p ns2:paraId="6FE5194A" ns2:textId="77777777">
       <w:pPr>
         <w:pStyle w:val="BodyText"/>
         <w:tabs>
@@ -120,7 +120,7 @@
         <w:t>i</w:t>
       </w:r>
     </w:p>
-    <w:p>
+    <w:p ns2:paraId="43081B00" ns2:textId="77777777">
       <w:pPr>
         <w:pStyle w:val="BodyText"/>
         <w:spacing w:line="246" w:lineRule="exact"/>
@@ -133,7 +133,7 @@
         <w:t>automatika</w:t>
       </w:r>
     </w:p>
-    <w:p>
+    <w:p ns2:paraId="2900B73A" ns2:textId="77777777">
       <w:pPr>
         <w:pStyle w:val="BodyText"/>
         <w:tabs>
@@ -159,7 +159,7 @@
         <w:t>inženjering Katedra za primenjene računarske nauke</w:t>
       </w:r>
     </w:p>
-    <w:p>
+    <w:p ns2:paraId="1B81F8F3" ns2:textId="77777777">
       <w:pPr>
         <w:spacing w:before="205"/>
         <w:rPr>
@@ -167,7 +167,7 @@
         </w:rPr>
       </w:pPr>
     </w:p>
-    <w:p>
+    <w:p ns2:paraId="643843B0" ns2:textId="77777777">
       <w:pPr>
         <w:pStyle w:val="Heading1"/>
         <w:jc w:val="center"/>
@@ -206,7 +206,7 @@
         <w:t>sistema</w:t>
       </w:r>
     </w:p>
-    <w:p>
+    <w:p ns2:paraId="5D89A6BB" ns2:textId="77777777">
       <w:pPr>
         <w:rPr>
           <w:b/>
@@ -214,7 +214,7 @@
         </w:rPr>
       </w:pPr>
     </w:p>
-    <w:p>
+    <w:p ns2:paraId="04CE2E14" ns2:textId="77777777">
       <w:pPr>
         <w:spacing w:before="12"/>
         <w:rPr>
@@ -223,7 +223,7 @@
         </w:rPr>
       </w:pPr>
     </w:p>
-    <w:p>
+    <w:p ns2:paraId="74CA5615" ns2:textId="77777777">
       <w:pPr>
         <w:jc w:val="center"/>
         <w:rPr>
@@ -264,7 +264,7 @@
         <w:t>projekta</w:t>
       </w:r>
     </w:p>
-    <w:p>
+    <w:p ns2:paraId="115552E7" ns2:textId="77777777">
       <w:pPr>
         <w:pStyle w:val="Title"/>
       </w:pPr>
@@ -284,7 +284,7 @@
         <w:t>kompanija</w:t>
       </w:r>
     </w:p>
-    <w:p>
+    <w:p ns2:paraId="115A115B" ns2:textId="77777777">
       <w:pPr>
         <w:spacing w:before="122"/>
         <w:jc w:val="center"/>
@@ -392,7 +392,7 @@
         <w:t>(CRM)</w:t>
       </w:r>
     </w:p>
-    <w:p>
+    <w:p ns2:paraId="475894B1" ns2:textId="77777777">
       <w:pPr>
         <w:spacing w:before="243"/>
         <w:rPr>
@@ -401,7 +401,7 @@
         </w:rPr>
       </w:pPr>
     </w:p>
-    <w:p>
+    <w:p ns2:paraId="2C4D32D4" ns2:textId="77777777">
       <w:pPr>
         <w:pStyle w:val="Heading1"/>
         <w:ind w:left="288"/>
@@ -422,7 +422,7 @@
         <w:t>tima:</w:t>
       </w:r>
     </w:p>
-    <w:p>
+    <w:p ns2:paraId="28A3B167" ns2:textId="77777777">
       <w:pPr>
         <w:pStyle w:val="ListParagraph"/>
         <w:numPr>
@@ -497,7 +497,7 @@
         <w:t>3/2022</w:t>
       </w:r>
     </w:p>
-    <w:p>
+    <w:p ns2:paraId="2AD993B6" ns2:textId="77777777">
       <w:pPr>
         <w:pStyle w:val="ListParagraph"/>
         <w:numPr>
@@ -585,7 +585,7 @@
         <w:t>72/2022</w:t>
       </w:r>
     </w:p>
-    <w:p>
+    <w:p ns2:paraId="7804780B" ns2:textId="77777777">
       <w:pPr>
         <w:pStyle w:val="ListParagraph"/>
         <w:numPr>
@@ -673,7 +673,7 @@
         <w:t>95/2022</w:t>
       </w:r>
     </w:p>
-    <w:p>
+    <w:p ns2:paraId="5E7E3069" ns2:textId="77777777">
       <w:pPr>
         <w:pStyle w:val="ListParagraph"/>
         <w:numPr>
@@ -761,14 +761,14 @@
         <w:t>174/2022</w:t>
       </w:r>
     </w:p>
-    <w:p>
+    <w:p ns2:paraId="2A141412" ns2:textId="77777777">
       <w:pPr>
         <w:rPr>
           <w:sz w:val="20"/>
         </w:rPr>
       </w:pPr>
     </w:p>
-    <w:p>
+    <w:p ns2:paraId="5F52CDE7" ns2:textId="77777777">
       <w:pPr>
         <w:spacing w:before="110"/>
         <w:rPr>
@@ -798,7 +798,7 @@
       <w:tblGrid>
         <w:gridCol w:w="11654"/>
       </w:tblGrid>
-      <w:tr>
+      <w:tr ns2:paraId="77FD1FA4" ns2:textId="77777777">
         <w:trPr>
           <w:trHeight w:val="449"/>
         </w:trPr>
@@ -807,7 +807,7 @@
             <w:tcW w:w="11654" w:type="dxa"/>
             <w:shd w:val="clear" w:color="auto" w:fill="E7E6E6"/>
           </w:tcPr>
-          <w:p>
+          <w:p ns2:paraId="06B20F2F" ns2:textId="77777777">
             <w:pPr>
               <w:pStyle w:val="TableParagraph"/>
               <w:ind w:left="10"/>
@@ -850,7 +850,7 @@
           </w:p>
         </w:tc>
       </w:tr>
-      <w:tr>
+      <w:tr ns2:paraId="3EABB1CA" ns2:textId="77777777">
         <w:trPr>
           <w:trHeight w:val="1949"/>
         </w:trPr>
@@ -858,7 +858,7 @@
           <w:tcPr>
             <w:tcW w:w="11654" w:type="dxa"/>
           </w:tcPr>
-          <w:p>
+          <w:p ns2:paraId="44B3BECE" ns2:textId="77777777">
             <w:pPr>
               <w:pStyle w:val="TableParagraph"/>
               <w:spacing w:line="261" w:lineRule="auto"/>
@@ -1254,14 +1254,14 @@
         </w:tc>
       </w:tr>
     </w:tbl>
-    <w:p>
+    <w:p ns2:paraId="5BD05AC3" ns2:textId="77777777">
       <w:pPr>
         <w:rPr>
           <w:sz w:val="20"/>
         </w:rPr>
       </w:pPr>
     </w:p>
-    <w:p>
+    <w:p ns2:paraId="6336D683" ns2:textId="77777777">
       <w:pPr>
         <w:spacing w:before="121" w:after="1"/>
         <w:rPr>
@@ -1291,7 +1291,7 @@
       <w:tblGrid>
         <w:gridCol w:w="11654"/>
       </w:tblGrid>
-      <w:tr>
+      <w:tr ns2:paraId="5451E178" ns2:textId="77777777">
         <w:trPr>
           <w:trHeight w:val="449"/>
         </w:trPr>
@@ -1300,7 +1300,7 @@
             <w:tcW w:w="11654" w:type="dxa"/>
             <w:shd w:val="clear" w:color="auto" w:fill="E7E6E6"/>
           </w:tcPr>
-          <w:p>
+          <w:p ns2:paraId="49D03A1A" ns2:textId="77777777">
             <w:pPr>
               <w:pStyle w:val="TableParagraph"/>
               <w:ind w:left="10"/>
@@ -1321,7 +1321,7 @@
           </w:p>
         </w:tc>
       </w:tr>
-      <w:tr>
+      <w:tr ns2:paraId="0F751C94" ns2:textId="77777777">
         <w:trPr>
           <w:trHeight w:val="1649"/>
         </w:trPr>
@@ -1329,7 +1329,7 @@
           <w:tcPr>
             <w:tcW w:w="11654" w:type="dxa"/>
           </w:tcPr>
-          <w:p>
+          <w:p ns2:paraId="64439341" ns2:textId="77777777">
             <w:pPr>
               <w:pStyle w:val="TableParagraph"/>
               <w:spacing w:line="261" w:lineRule="auto"/>
@@ -1350,14 +1350,14 @@
         </w:tc>
       </w:tr>
     </w:tbl>
-    <w:p>
+    <w:p ns2:paraId="1AD605D3" ns2:textId="77777777">
       <w:pPr>
         <w:rPr>
           <w:sz w:val="20"/>
         </w:rPr>
       </w:pPr>
     </w:p>
-    <w:p>
+    <w:p ns2:paraId="1FAA4200" ns2:textId="77777777">
       <w:pPr>
         <w:spacing w:before="121" w:after="1"/>
         <w:rPr>
@@ -1387,7 +1387,7 @@
       <w:tblGrid>
         <w:gridCol w:w="11654"/>
       </w:tblGrid>
-      <w:tr>
+      <w:tr ns2:paraId="224AE9BD" ns2:textId="77777777">
         <w:trPr>
           <w:trHeight w:val="449"/>
         </w:trPr>
@@ -1396,7 +1396,7 @@
             <w:tcW w:w="11654" w:type="dxa"/>
             <w:shd w:val="clear" w:color="auto" w:fill="E7E6E6"/>
           </w:tcPr>
-          <w:p>
+          <w:p ns2:paraId="61B2C560" ns2:textId="77777777">
             <w:pPr>
               <w:pStyle w:val="TableParagraph"/>
               <w:ind w:left="10"/>
@@ -1447,7 +1447,7 @@
           </w:p>
         </w:tc>
       </w:tr>
-      <w:tr>
+      <w:tr ns2:paraId="25D7DFAB" ns2:textId="77777777">
         <w:trPr>
           <w:trHeight w:val="1349"/>
         </w:trPr>
@@ -1455,7 +1455,7 @@
           <w:tcPr>
             <w:tcW w:w="11654" w:type="dxa"/>
           </w:tcPr>
-          <w:p>
+          <w:p ns2:paraId="2EF5C6C9" ns2:textId="77777777">
             <w:pPr>
               <w:pStyle w:val="TableParagraph"/>
               <w:spacing w:line="261" w:lineRule="auto"/>
@@ -1731,7 +1731,7 @@
         </w:tc>
       </w:tr>
     </w:tbl>
-    <w:p>
+    <w:p ns2:paraId="65AC6402" ns2:textId="77777777">
       <w:pPr>
         <w:pStyle w:val="TableParagraph"/>
         <w:spacing w:line="261" w:lineRule="auto"/>
@@ -1747,7 +1747,7 @@
         </w:sectPr>
       </w:pPr>
     </w:p>
-    <w:p>
+    <w:p ns2:paraId="2185861B" ns2:textId="77777777">
       <w:pPr>
         <w:spacing w:before="5"/>
         <w:rPr>
@@ -1777,7 +1777,7 @@
       <w:tblGrid>
         <w:gridCol w:w="11654"/>
       </w:tblGrid>
-      <w:tr>
+      <w:tr ns2:paraId="50A988E2" ns2:textId="77777777">
         <w:trPr>
           <w:trHeight w:val="449"/>
         </w:trPr>
@@ -1786,7 +1786,7 @@
             <w:tcW w:w="11654" w:type="dxa"/>
             <w:shd w:val="clear" w:color="auto" w:fill="E7E6E6"/>
           </w:tcPr>
-          <w:p>
+          <w:p ns2:paraId="1A768A6F" ns2:textId="77777777">
             <w:pPr>
               <w:pStyle w:val="TableParagraph"/>
               <w:ind w:left="10" w:right="1"/>
@@ -1852,7 +1852,7 @@
           </w:p>
         </w:tc>
       </w:tr>
-      <w:tr>
+      <w:tr ns2:paraId="21CC38A0" ns2:textId="77777777">
         <w:trPr>
           <w:trHeight w:val="4041"/>
         </w:trPr>
@@ -1860,7 +1860,7 @@
           <w:tcPr>
             <w:tcW w:w="11654" w:type="dxa"/>
           </w:tcPr>
-          <w:p>
+          <w:p ns2:paraId="12F527A9" ns2:textId="77777777">
             <w:pPr>
               <w:pStyle w:val="TableParagraph"/>
               <w:numPr>
@@ -1886,7 +1886,7 @@
               <w:t>SalesProcessTrackingService:</w:t>
             </w:r>
           </w:p>
-          <w:p>
+          <w:p ns2:paraId="61FF44E6" ns2:textId="77777777">
             <w:pPr>
               <w:pStyle w:val="TableParagraph"/>
               <w:numPr>
@@ -1918,7 +1918,7 @@
               <w:t>Mikroservis zadužen za podsistem za praćenje procesa prodaje u farmaceutskoj kompaniji. Omogućava upravljanje kupcima, prodajnim procesima, fazama prodaje i prodajnim predstavnicima, kao i definisanje relacija između njih.Takodje ovaj mikroservis se koristi za praćenje neželjenih efekata lekova kao i za evidenciju i analizu prijava od strane pacijenata ili lekara.</w:t>
             </w:r>
           </w:p>
-          <w:p>
+          <w:p ns2:paraId="190328D6" ns2:textId="77777777">
             <w:pPr>
               <w:pStyle w:val="TableParagraph"/>
               <w:numPr>
@@ -1965,7 +1965,7 @@
               <w:t>je omogućavanje analize i identifikacije obrazaca u prijavama neželjenih efekata lekova</w:t>
             </w:r>
           </w:p>
-          <w:p>
+          <w:p ns2:paraId="29426832" ns2:textId="77777777">
             <w:pPr>
               <w:pStyle w:val="TableParagraph"/>
               <w:numPr>
@@ -1997,7 +1997,7 @@
               <w:t>Neo4j grafskа baza podataka, namenjena za modelovanje odnosa između entiteta kao što su kupci, prodajni procesi, faze i prodajni predstavnici, kao i za efikasno izvršavanje upita nad relacijama.Ova grafska baza je korišćena za modelovanje veza izmedju entiteta radi lakšeg praćenja neželjenih efekata lekova.</w:t>
             </w:r>
           </w:p>
-          <w:p>
+          <w:p ns2:paraId="73A40075" ns2:textId="77777777">
             <w:pPr>
               <w:pStyle w:val="TableParagraph"/>
               <w:numPr>
@@ -2023,7 +2023,7 @@
               <w:t>CollaborativePriceListService:</w:t>
             </w:r>
           </w:p>
-          <w:p>
+          <w:p ns2:paraId="75B26E7A" ns2:textId="77777777">
             <w:pPr>
               <w:pStyle w:val="TableParagraph"/>
               <w:numPr>
@@ -2055,7 +2055,7 @@
               <w:t>Mikroservis koji je deo podsistema za kreiranje i upravljanje cenovnicima. Omogućava kreiranje timova, dodeljivanje članova istim, postaviti tim tim da radi na odredjenom cenovniku koji se razvija za zadatom region. Takodje, evidentiraju se raznolike akcije koje članovi tima izvršavaju.</w:t>
             </w:r>
           </w:p>
-          <w:p>
+          <w:p ns2:paraId="594546C3" ns2:textId="77777777">
             <w:pPr>
               <w:pStyle w:val="TableParagraph"/>
               <w:numPr>
@@ -2110,7 +2110,7 @@
               <w:t>se spreče konflikti pri radu i da se omogući analitika produktivnosti na osnovu istorije akcija korisnika. Jedinstven pogled na kolaboraciju unutar i odgovornost svih timova u kompaniji.</w:t>
             </w:r>
           </w:p>
-          <w:p>
+          <w:p ns2:paraId="51B89E33" ns2:textId="77777777">
             <w:pPr>
               <w:pStyle w:val="TableParagraph"/>
               <w:numPr>
@@ -2150,7 +2150,7 @@
               <w:t>vremenu.</w:t>
             </w:r>
           </w:p>
-          <w:p>
+          <w:p ns2:paraId="3299F1EE" ns2:textId="77777777">
             <w:pPr>
               <w:pStyle w:val="TableParagraph"/>
               <w:numPr>
@@ -2176,7 +2176,7 @@
               <w:t>ProductPortfolioService:</w:t>
             </w:r>
           </w:p>
-          <w:p>
+          <w:p ns2:paraId="56E30469" ns2:textId="77777777">
             <w:pPr>
               <w:pStyle w:val="TableParagraph"/>
               <w:numPr>
@@ -2216,7 +2216,7 @@
               <w:t>Mikroservis zadužen za podsistem za rad sa portfoliom proizvoda u farmaceutskoj kompaniji. Omogućava upravljanje proizvodima, kategorijama, varijantama proizvoda, tržištima i statusima životnog ciklusa proizvoda, kao i definisanje relacija između njih.</w:t>
             </w:r>
           </w:p>
-          <w:p>
+          <w:p ns2:paraId="5E2D1EE3" ns2:textId="77777777">
             <w:pPr>
               <w:pStyle w:val="TableParagraph"/>
               <w:numPr>
@@ -2391,7 +2391,7 @@
               <w:t>proizvoda, uključujući hijerarhiju proizvoda, varijante, dostupnost po tržištima i stanje proizvoda u životnom ciklusu. Mikroservis omogućava izvođenje složenih upita nad grafom radi analize stanja portfolia po kategorijama, statusima i tržištima.</w:t>
             </w:r>
           </w:p>
-          <w:p>
+          <w:p ns2:paraId="0406D624" ns2:textId="77777777">
             <w:pPr>
               <w:pStyle w:val="TableParagraph"/>
               <w:numPr>
@@ -2423,7 +2423,7 @@
               <w:t>Neo4j grafskа baza podataka, korišćena za predstavljanje složenih hijerarhijskih struktura proizvoda i njihovih međusobnih veza. Omogućava efikasno modelovanje odnosa između kategorija, proizvoda, varijanti i tržišta, kao i izvođenje analitičkih upita nad strukturom portfolia i statusima proizvoda.</w:t>
             </w:r>
           </w:p>
-          <w:p>
+          <w:p ns2:paraId="64D6B53B" ns2:textId="60CA1DFF">
             <w:pPr>
               <w:pStyle w:val="TableParagraph"/>
               <w:numPr>
@@ -2457,7 +2457,7 @@
               <w:t>:</w:t>
             </w:r>
           </w:p>
-          <w:p>
+          <w:p ns2:paraId="7FBAB617" ns2:textId="77777777">
             <w:pPr>
               <w:pStyle w:val="TableParagraph"/>
               <w:numPr>
@@ -2510,7 +2510,7 @@
               <w:t xml:space="preserve"> </w:t>
             </w:r>
           </w:p>
-          <w:p>
+          <w:p ns2:paraId="38E89162" ns2:textId="77777777">
             <w:pPr>
               <w:pStyle w:val="TableParagraph"/>
               <w:numPr>
@@ -2567,7 +2567,7 @@
               <w:t xml:space="preserve"> trajanja faza, detekciju anomalija i vremenske trendove. </w:t>
             </w:r>
           </w:p>
-          <w:p>
+          <w:p ns2:paraId="7A03F561" ns2:textId="77777777">
             <w:pPr>
               <w:pStyle w:val="TableParagraph"/>
               <w:numPr>
@@ -2606,7 +2606,7 @@
               <w:t xml:space="preserve"> ,visoko perfomantna baza podataka dizajnirana da na efektivan način prikuplja, skladišti i analizira podatke koje sadrže vremensku odrednicu(timestamp). Sposobna da primi masivni tok podataka o svim promenama statusa svih cenovnika i vrati skoro instant odgovore na upite.</w:t>
             </w:r>
           </w:p>
-          <w:p>
+          <w:p ns2:paraId="22D76DC0" ns2:textId="4B103769">
             <w:pPr>
               <w:pStyle w:val="TableParagraph"/>
               <w:numPr>
@@ -2642,7 +2642,7 @@
               <w:t>:</w:t>
             </w:r>
           </w:p>
-          <w:p>
+          <w:p ns2:paraId="78BF5A8C" ns2:textId="15FFDB76">
             <w:pPr>
               <w:pStyle w:val="TableParagraph"/>
               <w:numPr>
@@ -3104,7 +3104,7 @@
               <w:t>.</w:t>
             </w:r>
           </w:p>
-          <w:p>
+          <w:p ns2:paraId="6AD32603" ns2:textId="6342C53F">
             <w:pPr>
               <w:pStyle w:val="TableParagraph"/>
               <w:numPr>
@@ -3695,7 +3695,7 @@
               <w:t>.</w:t>
             </w:r>
           </w:p>
-          <w:p>
+          <w:p ns2:paraId="3E847876" ns2:textId="0A786182">
             <w:pPr>
               <w:pStyle w:val="TableParagraph"/>
               <w:numPr>
@@ -4294,7 +4294,7 @@
               <w:t>.</w:t>
             </w:r>
           </w:p>
-          <w:p>
+          <w:p ns2:paraId="19DF2CF3" ns2:textId="79881C69">
             <w:pPr>
               <w:pStyle w:val="TableParagraph"/>
               <w:numPr>
@@ -5061,10 +5061,61 @@
               <w:t>.</w:t>
             </w:r>
           </w:p>
+          <w:p>
+            <w:pPr>
+              <w:pStyle w:val="TableParagraph"/>
+            </w:pPr>
+            <w:r>
+              <w:rPr>
+                <w:b/>
+              </w:rPr>
+              <w:t>AdverseEffectsSearchService:</w:t>
+            </w:r>
+          </w:p>
+          <w:p>
+            <w:pPr>
+              <w:pStyle w:val="TableParagraph"/>
+            </w:pPr>
+            <w:r>
+              <w:t>Opis: Mikroservis zaduzen za podsistem za pretragu i analizu nezeljenih efekata lekova u farmaceutskoj kompaniji. Omogucava upravljanje dokumentima o lekovima i pojedinacnim prijavama nezeljenih reakcija, kao i pretragu po tekstualnim opisima, simptomima, ozbiljnosti reakcije, regionu, terapijskoj klasi i proizvodjacu.</w:t>
+            </w:r>
+          </w:p>
+          <w:p>
+            <w:pPr>
+              <w:pStyle w:val="TableParagraph"/>
+            </w:pPr>
+            <w:r>
+              <w:t>Svrha mikroservisa: Svrha mikroservisa je brzo pronalazenje rizicnih lekova i analiza prijavljenih nezeljenih efekata. Mikroservis podrzava slozene analiticke upite nad indeksiranim podacima, ukljucujuci full-text pretragu, filtriranje, sortiranje i agregacije, cime se omogucava pracenje bezbednosti lekova i donosenje odluka zasnovanih na podacima.</w:t>
+            </w:r>
+          </w:p>
+          <w:p>
+            <w:pPr>
+              <w:pStyle w:val="TableParagraph"/>
+            </w:pPr>
+            <w:r>
+              <w:t>Baza podataka: Elasticsearch se koristi kao NoSQL baza za pretragu i analitiku. U mikroservisu postoje indeksi drugs i adverse_event_reports, koji se automatski pune sa najmanje 1000 dokumenata po indeksu. Za oba indeksa postoje CRUD endpointi, a nad njima se izvrsavaju slozeni upiti: drug-risk-search, reports-by-region i manufacturer-safety.</w:t>
+            </w:r>
+          </w:p>
+          <w:p>
+            <w:pPr>
+              <w:pStyle w:val="TableParagraph"/>
+            </w:pPr>
+            <w:r>
+              <w:t>Kljuc-vrednost baza podataka: Redis se koristi kao kes sloj za cesto trazene lekove, prijave nezeljenih efekata i rezultate slozenih analitickih upita iz Elasticsearch-a. Kesirani podaci imaju TTL, pri izmeni ili brisanju dokumenata vrsi se invalidacija odgovarajucih kljuceva, a kroz Redis hash strukturu cache:statistics prati se broj cache hit i cache miss dogadjaja. Dodatno, endpoint /api/key-value omogucava rucno cuvanje kratkih domen-specificnih zapisa, proveru TTL-a, proveru postojanja kljuca, pretragu kljuceva po sablonu i rad sa Redis hash strukturama.</w:t>
+            </w:r>
+          </w:p>
+          <w:p>
+            <w:pPr>
+              <w:pStyle w:val="TableParagraph"/>
+            </w:pPr>
+            <w:r>
+              <w:t>Mikroservisna integracija: Mikroservis se pokrece kao poseban servis u docker-compose.yml, registrovan je u Eureki pod nazivom adverse-effects-search-service, a Gateway mu prosledjuje zahteve preko putanje /adverse-effects-search-service/**.</w:t>
+            </w:r>
+          </w:p>
         </w:tc>
       </w:tr>
     </w:tbl>
-    <w:p>
+    <w:p ns2:paraId="32A51D81" ns2:textId="77777777">
       <w:pPr>
         <w:spacing w:before="1"/>
         <w:rPr>
@@ -5097,7 +5148,7 @@
         <w:gridCol w:w="3885"/>
         <w:gridCol w:w="3885"/>
       </w:tblGrid>
-      <w:tr>
+      <w:tr ns2:paraId="10FB3623" ns2:textId="77777777">
         <w:trPr>
           <w:trHeight w:val="390"/>
         </w:trPr>
@@ -5106,7 +5157,7 @@
             <w:tcW w:w="3885" w:type="dxa"/>
             <w:shd w:val="clear" w:color="auto" w:fill="E7E6E6"/>
           </w:tcPr>
-          <w:p>
+          <w:p ns2:paraId="0369AD5E" ns2:textId="77777777">
             <w:pPr>
               <w:pStyle w:val="TableParagraph"/>
               <w:spacing w:before="57"/>
@@ -5130,7 +5181,7 @@
             <w:tcW w:w="3885" w:type="dxa"/>
             <w:shd w:val="clear" w:color="auto" w:fill="E7E6E6"/>
           </w:tcPr>
-          <w:p>
+          <w:p ns2:paraId="082C97EA" ns2:textId="77777777">
             <w:pPr>
               <w:pStyle w:val="TableParagraph"/>
               <w:spacing w:before="57"/>
@@ -5154,7 +5205,7 @@
             <w:tcW w:w="3885" w:type="dxa"/>
             <w:shd w:val="clear" w:color="auto" w:fill="E7E6E6"/>
           </w:tcPr>
-          <w:p>
+          <w:p ns2:paraId="31CC984B" ns2:textId="77777777">
             <w:pPr>
               <w:pStyle w:val="TableParagraph"/>
               <w:spacing w:before="57"/>
@@ -5187,7 +5238,7 @@
           </w:p>
         </w:tc>
       </w:tr>
-      <w:tr>
+      <w:tr ns2:paraId="78D993C8" ns2:textId="77777777">
         <w:trPr>
           <w:trHeight w:val="449"/>
         </w:trPr>
@@ -5195,7 +5246,7 @@
           <w:tcPr>
             <w:tcW w:w="3885" w:type="dxa"/>
           </w:tcPr>
-          <w:p>
+          <w:p ns2:paraId="10589BBC" ns2:textId="77777777">
             <w:pPr>
               <w:pStyle w:val="TableParagraph"/>
               <w:jc w:val="left"/>
@@ -5228,19 +5279,17 @@
           <w:p>
             <w:pPr>
               <w:pStyle w:val="TableParagraph"/>
-              <w:jc w:val="left"/>
-              <w:rPr>
-                <w:i/>
-                <w:sz w:val="24"/>
-              </w:rPr>
             </w:pPr>
             <w:r>
-              <w:rPr>
-                <w:i/>
-                <w:spacing w:val="-2"/>
-                <w:sz w:val="24"/>
-              </w:rPr>
               <w:t>SalesProcessTrackingService</w:t>
+            </w:r>
+          </w:p>
+          <w:p>
+            <w:pPr>
+              <w:pStyle w:val="TableParagraph"/>
+            </w:pPr>
+            <w:r>
+              <w:t>AdverseEffectsSearchService</w:t>
             </w:r>
           </w:p>
         </w:tc>
@@ -5251,69 +5300,30 @@
           <w:p>
             <w:pPr>
               <w:pStyle w:val="TableParagraph"/>
-              <w:jc w:val="left"/>
-              <w:rPr>
-                <w:i/>
-                <w:sz w:val="24"/>
-              </w:rPr>
             </w:pPr>
             <w:r>
-              <w:rPr>
-                <w:i/>
-                <w:sz w:val="24"/>
-              </w:rPr>
-              <w:t>Neo4j</w:t>
-            </w:r>
-            <w:r>
-              <w:rPr>
-                <w:i/>
-                <w:spacing w:val="-2"/>
-                <w:sz w:val="24"/>
-              </w:rPr>
-              <w:t xml:space="preserve"> </w:t>
-            </w:r>
-            <w:r>
-              <w:rPr>
-                <w:i/>
-                <w:sz w:val="24"/>
-              </w:rPr>
-              <w:t>Grafska</w:t>
-            </w:r>
-            <w:r>
-              <w:rPr>
-                <w:i/>
-                <w:spacing w:val="-1"/>
-                <w:sz w:val="24"/>
-              </w:rPr>
-              <w:t xml:space="preserve"> </w:t>
-            </w:r>
-            <w:r>
-              <w:rPr>
-                <w:i/>
-                <w:sz w:val="24"/>
-              </w:rPr>
-              <w:t>baza</w:t>
-            </w:r>
-            <w:r>
-              <w:rPr>
-                <w:i/>
-                <w:spacing w:val="-1"/>
-                <w:sz w:val="24"/>
-              </w:rPr>
-              <w:t xml:space="preserve"> </w:t>
-            </w:r>
-            <w:r>
-              <w:rPr>
-                <w:i/>
-                <w:spacing w:val="-2"/>
-                <w:sz w:val="24"/>
-              </w:rPr>
-              <w:t>podataka</w:t>
+              <w:t>Neo4j Grafska baza podataka</w:t>
+            </w:r>
+          </w:p>
+          <w:p>
+            <w:pPr>
+              <w:pStyle w:val="TableParagraph"/>
+            </w:pPr>
+            <w:r>
+              <w:t>Elasticsearch (baza za pretragu i analitiku)</w:t>
+            </w:r>
+          </w:p>
+          <w:p>
+            <w:pPr>
+              <w:pStyle w:val="TableParagraph"/>
+            </w:pPr>
+            <w:r>
+              <w:t>Redis (baza podataka tipa kljuc-vrednost)</w:t>
             </w:r>
           </w:p>
         </w:tc>
       </w:tr>
-      <w:tr>
+      <w:tr ns2:paraId="0CE7907A" ns2:textId="77777777">
         <w:trPr>
           <w:trHeight w:val="449"/>
         </w:trPr>
@@ -5321,7 +5331,7 @@
           <w:tcPr>
             <w:tcW w:w="3885" w:type="dxa"/>
           </w:tcPr>
-          <w:p>
+          <w:p ns2:paraId="4E074C87" ns2:textId="77777777">
             <w:pPr>
               <w:pStyle w:val="TableParagraph"/>
               <w:jc w:val="left"/>
@@ -5354,49 +5364,18 @@
           <w:p>
             <w:pPr>
               <w:pStyle w:val="TableParagraph"/>
-              <w:jc w:val="left"/>
-              <w:rPr>
-                <w:i/>
-                <w:spacing w:val="-2"/>
-                <w:sz w:val="24"/>
-              </w:rPr>
             </w:pPr>
             <w:r>
-              <w:rPr>
-                <w:i/>
-                <w:spacing w:val="-2"/>
-                <w:sz w:val="24"/>
-              </w:rPr>
-              <w:t>SalesProcessTrackingService</w:t>
-            </w:r>
-            <w:r>
-              <w:rPr>
-                <w:i/>
-                <w:spacing w:val="-2"/>
-                <w:sz w:val="24"/>
-              </w:rPr>
-              <w:t>,</w:t>
+              <w:t>SalesProcessTrackingService,</w:t>
             </w:r>
           </w:p>
           <w:p>
             <w:pPr>
               <w:pStyle w:val="TableParagraph"/>
-              <w:rPr>
-                <w:i/>
-                <w:sz w:val="24"/>
-                <w:lang w:val="en-US"/>
-              </w:rPr>
             </w:pPr>
-            <w:proofErr w:type="spellStart"/>
-            <w:r>
-              <w:rPr>
-                <w:i/>
-                <w:sz w:val="24"/>
-                <w:lang w:val="en-US"/>
-              </w:rPr>
+            <w:r>
               <w:t>SalesAnalyticsService</w:t>
             </w:r>
-            <w:proofErr w:type="spellEnd"/>
           </w:p>
         </w:tc>
         <w:tc>
@@ -5406,111 +5385,30 @@
           <w:p>
             <w:pPr>
               <w:pStyle w:val="TableParagraph"/>
-              <w:jc w:val="left"/>
-              <w:rPr>
-                <w:i/>
-                <w:spacing w:val="-2"/>
-                <w:sz w:val="24"/>
-              </w:rPr>
             </w:pPr>
             <w:r>
-              <w:rPr>
-                <w:i/>
-                <w:sz w:val="24"/>
-              </w:rPr>
-              <w:t>Neo4j</w:t>
-            </w:r>
-            <w:r>
-              <w:rPr>
-                <w:i/>
-                <w:spacing w:val="-2"/>
-                <w:sz w:val="24"/>
-              </w:rPr>
-              <w:t xml:space="preserve"> </w:t>
-            </w:r>
-            <w:r>
-              <w:rPr>
-                <w:i/>
-                <w:sz w:val="24"/>
-              </w:rPr>
-              <w:t>(grafskа</w:t>
-            </w:r>
-            <w:r>
-              <w:rPr>
-                <w:i/>
-                <w:spacing w:val="-2"/>
-                <w:sz w:val="24"/>
-              </w:rPr>
-              <w:t xml:space="preserve"> </w:t>
-            </w:r>
-            <w:r>
-              <w:rPr>
-                <w:i/>
-                <w:sz w:val="24"/>
-              </w:rPr>
-              <w:t>baza</w:t>
-            </w:r>
-            <w:r>
-              <w:rPr>
-                <w:i/>
-                <w:spacing w:val="-2"/>
-                <w:sz w:val="24"/>
-              </w:rPr>
-              <w:t xml:space="preserve"> podataka)</w:t>
+              <w:t>Neo4j (grafskа baza podataka)</w:t>
             </w:r>
           </w:p>
           <w:p>
             <w:pPr>
               <w:pStyle w:val="TableParagraph"/>
-              <w:jc w:val="left"/>
-              <w:rPr>
-                <w:i/>
-                <w:sz w:val="24"/>
-              </w:rPr>
             </w:pPr>
             <w:r>
-              <w:rPr>
-                <w:i/>
-                <w:sz w:val="24"/>
-              </w:rPr>
               <w:t>InfluxDB (baza podataka vremenskih nizova)</w:t>
             </w:r>
           </w:p>
           <w:p>
             <w:pPr>
               <w:pStyle w:val="TableParagraph"/>
-              <w:jc w:val="left"/>
-              <w:rPr>
-                <w:i/>
-                <w:sz w:val="24"/>
-              </w:rPr>
             </w:pPr>
             <w:r>
-              <w:rPr>
-                <w:i/>
-                <w:sz w:val="24"/>
-              </w:rPr>
-              <w:t>Redis (baza podataka tipa klju</w:t>
-            </w:r>
-            <w:r>
-              <w:rPr>
-                <w:i/>
-                <w:sz w:val="24"/>
-                <w:lang w:val="sr-Latn-RS"/>
-              </w:rPr>
-              <w:t>č-vrednost</w:t>
-            </w:r>
-            <w:r>
-              <w:rPr>
-                <w:i/>
-                <w:sz w:val="24"/>
-              </w:rPr>
-              <w:t>)</w:t>
+              <w:t>Redis (baza podataka tipa ključ-vrednost)</w:t>
             </w:r>
           </w:p>
         </w:tc>
       </w:tr>
-      <w:tr>
+      <w:tr ns2:paraId="1CEF963E" ns2:textId="77777777">
         <w:trPr>
           <w:trHeight w:val="449"/>
         </w:trPr>
@@ -5518,7 +5416,7 @@
           <w:tcPr>
             <w:tcW w:w="3885" w:type="dxa"/>
           </w:tcPr>
-          <w:p>
+          <w:p ns2:paraId="2A9E5850" ns2:textId="77777777">
             <w:pPr>
               <w:pStyle w:val="TableParagraph"/>
               <w:jc w:val="left"/>
@@ -5556,7 +5454,7 @@
           <w:tcPr>
             <w:tcW w:w="3885" w:type="dxa"/>
           </w:tcPr>
-          <w:p>
+          <w:p ns2:paraId="17AEAD30" ns2:textId="77777777">
             <w:pPr>
               <w:pStyle w:val="TableParagraph"/>
               <w:jc w:val="left"/>
@@ -5575,7 +5473,7 @@
               <w:t>CollaborativePriceListService</w:t>
             </w:r>
           </w:p>
-          <w:p>
+          <w:p ns2:paraId="2336BFCA" ns2:textId="77777777">
             <w:pPr>
               <w:pStyle w:val="TableParagraph"/>
               <w:jc w:val="left"/>
@@ -5597,7 +5495,7 @@
           <w:tcPr>
             <w:tcW w:w="3885" w:type="dxa"/>
           </w:tcPr>
-          <w:p>
+          <w:p ns2:paraId="06686873" ns2:textId="77777777">
             <w:pPr>
               <w:pStyle w:val="TableParagraph"/>
               <w:jc w:val="left"/>
@@ -5646,7 +5544,7 @@
               <w:t>podataka</w:t>
             </w:r>
           </w:p>
-          <w:p>
+          <w:p ns2:paraId="6E7BC2DD" ns2:textId="77777777">
             <w:pPr>
               <w:pStyle w:val="TableParagraph"/>
               <w:jc w:val="left"/>
@@ -5665,7 +5563,7 @@
           </w:p>
         </w:tc>
       </w:tr>
-      <w:tr>
+      <w:tr ns2:paraId="68DD2AE1" ns2:textId="77777777">
         <w:trPr>
           <w:trHeight w:val="449"/>
         </w:trPr>
@@ -5673,7 +5571,7 @@
           <w:tcPr>
             <w:tcW w:w="3885" w:type="dxa"/>
           </w:tcPr>
-          <w:p>
+          <w:p ns2:paraId="2E63890A" ns2:textId="166A9377">
             <w:pPr>
               <w:pStyle w:val="TableParagraph"/>
               <w:jc w:val="left"/>
@@ -5711,7 +5609,7 @@
           <w:tcPr>
             <w:tcW w:w="3885" w:type="dxa"/>
           </w:tcPr>
-          <w:p>
+          <w:p ns2:paraId="3B8D072B" ns2:textId="77777777">
             <w:pPr>
               <w:pStyle w:val="TableParagraph"/>
               <w:jc w:val="left"/>
@@ -5735,7 +5633,7 @@
           <w:tcPr>
             <w:tcW w:w="3885" w:type="dxa"/>
           </w:tcPr>
-          <w:p>
+          <w:p ns2:paraId="2C58E1DA" ns2:textId="77777777">
             <w:pPr>
               <w:pStyle w:val="TableParagraph"/>
               <w:jc w:val="left"/>
@@ -5793,7 +5691,7 @@
         </w:tc>
       </w:tr>
     </w:tbl>
-    <w:p>
+    <w:p ns2:paraId="07C2ECE8" ns2:textId="77777777">
       <w:pPr>
         <w:pStyle w:val="TableParagraph"/>
         <w:ind w:left="0"/>
@@ -5809,7 +5707,7 @@
         </w:sectPr>
       </w:pPr>
     </w:p>
-    <w:p/>
+    <w:p ns2:paraId="209ADFA1" ns2:textId="10E72091"/>
     <w:sectPr>
       <w:pgSz w:w="12240" w:h="15840"/>
       <w:pgMar w:top="260" w:right="0" w:bottom="280" w:left="0" w:header="720" w:footer="720" w:gutter="0"/>

</xml_diff>